<commit_message>
Lecture 0 is in progress, dived in CSS
</commit_message>
<xml_diff>
--- a/Lecture_0_HTML_CSS.docx
+++ b/Lecture_0_HTML_CSS.docx
@@ -1,6 +1,6 @@
 
 <file path=word/document.xml><?xml version="1.0" encoding="utf-8"?>
-<w:document xmlns:wpc="http://schemas.microsoft.com/office/word/2010/wordprocessingCanvas" xmlns:cx="http://schemas.microsoft.com/office/drawing/2014/chartex" xmlns:cx1="http://schemas.microsoft.com/office/drawing/2015/9/8/chartex" xmlns:cx2="http://schemas.microsoft.com/office/drawing/2015/10/21/chartex" xmlns:cx3="http://schemas.microsoft.com/office/drawing/2016/5/9/chartex" xmlns:cx4="http://schemas.microsoft.com/office/drawing/2016/5/10/chartex" xmlns:cx5="http://schemas.microsoft.com/office/drawing/2016/5/11/chartex" xmlns:cx6="http://schemas.microsoft.com/office/drawing/2016/5/12/chartex" xmlns:cx7="http://schemas.microsoft.com/office/drawing/2016/5/13/chartex" xmlns:cx8="http://schemas.microsoft.com/office/drawing/2016/5/14/chartex" xmlns:mc="http://schemas.openxmlformats.org/markup-compatibility/2006" xmlns:aink="http://schemas.microsoft.com/office/drawing/2016/ink" xmlns:am3d="http://schemas.microsoft.com/office/drawing/2017/model3d" xmlns:o="urn:schemas-microsoft-com:office:office" xmlns:oel="http://schemas.microsoft.com/office/2019/extlst" xmlns:r="http://schemas.openxmlformats.org/officeDocument/2006/relationships" xmlns:m="http://schemas.openxmlformats.org/officeDocument/2006/math" xmlns:v="urn:schemas-microsoft-com:vml" xmlns:wp14="http://schemas.microsoft.com/office/word/2010/wordprocessingDrawing" xmlns:wp="http://schemas.openxmlformats.org/drawingml/2006/wordprocessingDrawing" xmlns:w10="urn:schemas-microsoft-com:office:word" xmlns:w="http://schemas.openxmlformats.org/wordprocessingml/2006/main" xmlns:w14="http://schemas.microsoft.com/office/word/2010/wordml" xmlns:w15="http://schemas.microsoft.com/office/word/2012/wordml" xmlns:w16cex="http://schemas.microsoft.com/office/word/2018/wordml/cex" xmlns:w16cid="http://schemas.microsoft.com/office/word/2016/wordml/cid" xmlns:w16="http://schemas.microsoft.com/office/word/2018/wordml" xmlns:w16du="http://schemas.microsoft.com/office/word/2023/wordml/word16du" xmlns:w16sdtdh="http://schemas.microsoft.com/office/word/2020/wordml/sdtdatahash" xmlns:w16sdtfl="http://schemas.microsoft.com/office/word/2024/wordml/sdtformatlock" xmlns:w16se="http://schemas.microsoft.com/office/word/2015/wordml/symex" xmlns:wpg="http://schemas.microsoft.com/office/word/2010/wordprocessingGroup" xmlns:wpi="http://schemas.microsoft.com/office/word/2010/wordprocessingInk" xmlns:wne="http://schemas.microsoft.com/office/word/2006/wordml" xmlns:wps="http://schemas.microsoft.com/office/word/2010/wordprocessingShape" mc:Ignorable="w14 w15 w16se w16cid w16 w16cex w16sdtdh w16sdtfl w16du wp14">
+<w:document xmlns:wpc="http://schemas.microsoft.com/office/word/2010/wordprocessingCanvas" xmlns:cx="http://schemas.microsoft.com/office/drawing/2014/chartex" xmlns:cx1="http://schemas.microsoft.com/office/drawing/2015/9/8/chartex" xmlns:cx2="http://schemas.microsoft.com/office/drawing/2015/10/21/chartex" xmlns:cx3="http://schemas.microsoft.com/office/drawing/2016/5/9/chartex" xmlns:cx4="http://schemas.microsoft.com/office/drawing/2016/5/10/chartex" xmlns:cx5="http://schemas.microsoft.com/office/drawing/2016/5/11/chartex" xmlns:cx6="http://schemas.microsoft.com/office/drawing/2016/5/12/chartex" xmlns:cx7="http://schemas.microsoft.com/office/drawing/2016/5/13/chartex" xmlns:cx8="http://schemas.microsoft.com/office/drawing/2016/5/14/chartex" xmlns:mc="http://schemas.openxmlformats.org/markup-compatibility/2006" xmlns:aink="http://schemas.microsoft.com/office/drawing/2016/ink" xmlns:am3d="http://schemas.microsoft.com/office/drawing/2017/model3d" xmlns:o="urn:schemas-microsoft-com:office:office" xmlns:oel="http://schemas.microsoft.com/office/2019/extlst" xmlns:r="http://schemas.openxmlformats.org/officeDocument/2006/relationships" xmlns:m="http://schemas.openxmlformats.org/officeDocument/2006/math" xmlns:v="urn:schemas-microsoft-com:vml" xmlns:wp14="http://schemas.microsoft.com/office/word/2010/wordprocessingDrawing" xmlns:wp="http://schemas.openxmlformats.org/drawingml/2006/wordprocessingDrawing" xmlns:w10="urn:schemas-microsoft-com:office:word" xmlns:w="http://schemas.openxmlformats.org/wordprocessingml/2006/main" xmlns:w14="http://schemas.microsoft.com/office/word/2010/wordml" xmlns:w15="http://schemas.microsoft.com/office/word/2012/wordml" xmlns:w16cex="http://schemas.microsoft.com/office/word/2018/wordml/cex" xmlns:w16cid="http://schemas.microsoft.com/office/word/2016/wordml/cid" xmlns:w16="http://schemas.microsoft.com/office/word/2018/wordml" xmlns:w16sdtdh="http://schemas.microsoft.com/office/word/2020/wordml/sdtdatahash" xmlns:w16se="http://schemas.microsoft.com/office/word/2015/wordml/symex" xmlns:wpg="http://schemas.microsoft.com/office/word/2010/wordprocessingGroup" xmlns:wpi="http://schemas.microsoft.com/office/word/2010/wordprocessingInk" xmlns:wne="http://schemas.microsoft.com/office/word/2006/wordml" xmlns:wps="http://schemas.microsoft.com/office/word/2010/wordprocessingShape" mc:Ignorable="w14 w15 w16se w16cid w16 w16cex w16sdtdh wp14">
   <w:body>
     <w:p>
       <w:pPr>
@@ -83,7 +83,7 @@
                     </pic:cNvPicPr>
                   </pic:nvPicPr>
                   <pic:blipFill>
-                    <a:blip r:embed="rId5">
+                    <a:blip r:embed="rId7">
                       <a:extLst>
                         <a:ext uri="{28A0092B-C50C-407E-A947-70E740481C1C}">
                           <a14:useLocalDpi xmlns:a14="http://schemas.microsoft.com/office/drawing/2010/main" val="0"/>
@@ -187,21 +187,7 @@
         <w:rPr>
           <w:rFonts w:ascii="Times New Roman" w:hAnsi="Times New Roman"/>
         </w:rPr>
-        <w:t>&lt;</w:t>
-      </w:r>
-      <w:proofErr w:type="spellStart"/>
-      <w:r>
-        <w:rPr>
-          <w:rFonts w:ascii="Times New Roman" w:hAnsi="Times New Roman"/>
-        </w:rPr>
-        <w:t>ol</w:t>
-      </w:r>
-      <w:proofErr w:type="spellEnd"/>
-      <w:r>
-        <w:rPr>
-          <w:rFonts w:ascii="Times New Roman" w:hAnsi="Times New Roman"/>
-        </w:rPr>
-        <w:t xml:space="preserve">&gt; </w:t>
+        <w:t xml:space="preserve">&lt;ol&gt; </w:t>
       </w:r>
     </w:p>
     <w:p>
@@ -250,21 +236,7 @@
           <w:rFonts w:ascii="Times New Roman" w:hAnsi="Times New Roman"/>
         </w:rPr>
         <w:br/>
-        <w:t>&lt;/</w:t>
-      </w:r>
-      <w:proofErr w:type="spellStart"/>
-      <w:r>
-        <w:rPr>
-          <w:rFonts w:ascii="Times New Roman" w:hAnsi="Times New Roman"/>
-        </w:rPr>
-        <w:t>ol</w:t>
-      </w:r>
-      <w:proofErr w:type="spellEnd"/>
-      <w:r>
-        <w:rPr>
-          <w:rFonts w:ascii="Times New Roman" w:hAnsi="Times New Roman"/>
-        </w:rPr>
-        <w:t>&gt;</w:t>
+        <w:t>&lt;/ol&gt;</w:t>
       </w:r>
     </w:p>
     <w:p>
@@ -291,6 +263,7 @@
       <w:r>
         <w:rPr>
           <w:rFonts w:ascii="Times New Roman" w:hAnsi="Times New Roman"/>
+          <w:noProof/>
         </w:rPr>
         <w:drawing>
           <wp:inline distT="0" distB="0" distL="0" distR="0" wp14:anchorId="2449B105" wp14:editId="3A18CA09">
@@ -308,7 +281,7 @@
                     <pic:cNvPicPr/>
                   </pic:nvPicPr>
                   <pic:blipFill>
-                    <a:blip r:embed="rId6"/>
+                    <a:blip r:embed="rId8"/>
                     <a:stretch>
                       <a:fillRect/>
                     </a:stretch>
@@ -471,135 +444,33 @@
         <w:rPr>
           <w:rFonts w:ascii="Times New Roman" w:hAnsi="Times New Roman"/>
         </w:rPr>
-        <w:t>&lt;</w:t>
-      </w:r>
-      <w:proofErr w:type="spellStart"/>
-      <w:r>
-        <w:rPr>
-          <w:rFonts w:ascii="Times New Roman" w:hAnsi="Times New Roman"/>
-        </w:rPr>
-        <w:t>img</w:t>
-      </w:r>
-      <w:proofErr w:type="spellEnd"/>
-      <w:r>
-        <w:rPr>
-          <w:rFonts w:ascii="Times New Roman" w:hAnsi="Times New Roman"/>
-        </w:rPr>
-        <w:t xml:space="preserve"> </w:t>
-      </w:r>
-      <w:proofErr w:type="spellStart"/>
-      <w:r>
-        <w:rPr>
-          <w:rFonts w:ascii="Times New Roman" w:hAnsi="Times New Roman"/>
-        </w:rPr>
-        <w:t>src</w:t>
-      </w:r>
-      <w:proofErr w:type="spellEnd"/>
-      <w:r>
-        <w:rPr>
-          <w:rFonts w:ascii="Times New Roman" w:hAnsi="Times New Roman"/>
-        </w:rPr>
-        <w:t>=”cat.jpg” alt=”Text description, is a cat”&gt;</w:t>
-      </w:r>
-    </w:p>
-    <w:p>
-      <w:pPr>
-        <w:rPr>
-          <w:rFonts w:ascii="Times New Roman" w:hAnsi="Times New Roman"/>
-        </w:rPr>
-      </w:pPr>
-      <w:r>
-        <w:rPr>
-          <w:rFonts w:ascii="Times New Roman" w:hAnsi="Times New Roman"/>
-        </w:rPr>
-        <w:t>For image you will not have a closing tab and you will have to use it like this &lt;</w:t>
-      </w:r>
-      <w:proofErr w:type="spellStart"/>
-      <w:r>
-        <w:rPr>
-          <w:rFonts w:ascii="Times New Roman" w:hAnsi="Times New Roman"/>
-        </w:rPr>
-        <w:t>img</w:t>
-      </w:r>
-      <w:proofErr w:type="spellEnd"/>
-      <w:r>
-        <w:rPr>
-          <w:rFonts w:ascii="Times New Roman" w:hAnsi="Times New Roman"/>
-        </w:rPr>
-        <w:t xml:space="preserve">, after that the </w:t>
-      </w:r>
-      <w:proofErr w:type="spellStart"/>
-      <w:r>
-        <w:rPr>
-          <w:rFonts w:ascii="Times New Roman" w:hAnsi="Times New Roman"/>
-        </w:rPr>
-        <w:t>src</w:t>
-      </w:r>
-      <w:proofErr w:type="spellEnd"/>
-      <w:r>
-        <w:rPr>
-          <w:rFonts w:ascii="Times New Roman" w:hAnsi="Times New Roman"/>
-        </w:rPr>
-        <w:t xml:space="preserve"> or source of the image path and also for other scopes we would want to have alt, alternative a description of the image.</w:t>
-      </w:r>
-    </w:p>
-    <w:p>
-      <w:pPr>
-        <w:rPr>
-          <w:rFonts w:ascii="Times New Roman" w:hAnsi="Times New Roman"/>
-        </w:rPr>
-      </w:pPr>
-      <w:r>
-        <w:rPr>
-          <w:rFonts w:ascii="Times New Roman" w:hAnsi="Times New Roman"/>
-        </w:rPr>
-        <w:t>&lt;</w:t>
-      </w:r>
-      <w:proofErr w:type="spellStart"/>
-      <w:r>
-        <w:rPr>
-          <w:rFonts w:ascii="Times New Roman" w:hAnsi="Times New Roman"/>
-        </w:rPr>
-        <w:t>img</w:t>
-      </w:r>
-      <w:proofErr w:type="spellEnd"/>
-      <w:r>
-        <w:rPr>
-          <w:rFonts w:ascii="Times New Roman" w:hAnsi="Times New Roman"/>
-        </w:rPr>
-        <w:t xml:space="preserve"> </w:t>
-      </w:r>
-      <w:proofErr w:type="spellStart"/>
-      <w:r>
-        <w:rPr>
-          <w:rFonts w:ascii="Times New Roman" w:hAnsi="Times New Roman"/>
-        </w:rPr>
-        <w:t>src</w:t>
-      </w:r>
-      <w:proofErr w:type="spellEnd"/>
-      <w:r>
-        <w:rPr>
-          <w:rFonts w:ascii="Times New Roman" w:hAnsi="Times New Roman"/>
-        </w:rPr>
-        <w:t>=”cat.jpg” alt=”Text description, is a cat”</w:t>
-      </w:r>
-      <w:r>
-        <w:rPr>
-          <w:rFonts w:ascii="Times New Roman" w:hAnsi="Times New Roman"/>
-        </w:rPr>
-        <w:t xml:space="preserve"> width=”300” </w:t>
-      </w:r>
-      <w:r>
-        <w:rPr>
-          <w:rFonts w:ascii="Times New Roman" w:hAnsi="Times New Roman"/>
-        </w:rPr>
-        <w:t>&gt;</w:t>
-      </w:r>
-      <w:r>
-        <w:rPr>
-          <w:rFonts w:ascii="Times New Roman" w:hAnsi="Times New Roman"/>
-        </w:rPr>
-        <w:t xml:space="preserve"> </w:t>
+        <w:t>&lt;img src=”cat.jpg” alt=”Text description, is a cat”&gt;</w:t>
+      </w:r>
+    </w:p>
+    <w:p>
+      <w:pPr>
+        <w:rPr>
+          <w:rFonts w:ascii="Times New Roman" w:hAnsi="Times New Roman"/>
+        </w:rPr>
+      </w:pPr>
+      <w:r>
+        <w:rPr>
+          <w:rFonts w:ascii="Times New Roman" w:hAnsi="Times New Roman"/>
+        </w:rPr>
+        <w:t>For image you will not have a closing tab and you will have to use it like this &lt;img, after that the src or source of the image path and also for other scopes we would want to have alt, alternative a description of the image.</w:t>
+      </w:r>
+    </w:p>
+    <w:p>
+      <w:pPr>
+        <w:rPr>
+          <w:rFonts w:ascii="Times New Roman" w:hAnsi="Times New Roman"/>
+        </w:rPr>
+      </w:pPr>
+      <w:r>
+        <w:rPr>
+          <w:rFonts w:ascii="Times New Roman" w:hAnsi="Times New Roman"/>
+        </w:rPr>
+        <w:t xml:space="preserve">&lt;img src=”cat.jpg” alt=”Text description, is a cat” width=”300” &gt; </w:t>
       </w:r>
     </w:p>
     <w:p>
@@ -643,23 +514,9 @@
         <w:rPr>
           <w:rFonts w:ascii="Times New Roman" w:hAnsi="Times New Roman"/>
         </w:rPr>
-        <w:t xml:space="preserve">&lt;a </w:t>
-      </w:r>
-      <w:proofErr w:type="spellStart"/>
-      <w:r>
-        <w:rPr>
-          <w:rFonts w:ascii="Times New Roman" w:hAnsi="Times New Roman"/>
-        </w:rPr>
-        <w:t>href</w:t>
-      </w:r>
-      <w:proofErr w:type="spellEnd"/>
-      <w:r>
-        <w:rPr>
-          <w:rFonts w:ascii="Times New Roman" w:hAnsi="Times New Roman"/>
-        </w:rPr>
-        <w:t>=</w:t>
-      </w:r>
-      <w:hyperlink r:id="rId7" w:history="1">
+        <w:t>&lt;a href=</w:t>
+      </w:r>
+      <w:hyperlink r:id="rId9" w:history="1">
         <w:r>
           <w:rPr>
             <w:rStyle w:val="Hyperlink"/>
@@ -685,33 +542,7 @@
         <w:rPr>
           <w:rFonts w:ascii="Times New Roman" w:hAnsi="Times New Roman"/>
         </w:rPr>
-        <w:t xml:space="preserve">We can also link to our pages for example </w:t>
-      </w:r>
-      <w:r>
-        <w:rPr>
-          <w:rFonts w:ascii="Times New Roman" w:hAnsi="Times New Roman"/>
-        </w:rPr>
-        <w:t xml:space="preserve">&lt;a </w:t>
-      </w:r>
-      <w:proofErr w:type="spellStart"/>
-      <w:r>
-        <w:rPr>
-          <w:rFonts w:ascii="Times New Roman" w:hAnsi="Times New Roman"/>
-        </w:rPr>
-        <w:t>href</w:t>
-      </w:r>
-      <w:proofErr w:type="spellEnd"/>
-      <w:r>
-        <w:rPr>
-          <w:rFonts w:ascii="Times New Roman" w:hAnsi="Times New Roman"/>
-        </w:rPr>
-        <w:t>=”image.html”</w:t>
-      </w:r>
-      <w:r>
-        <w:rPr>
-          <w:rFonts w:ascii="Times New Roman" w:hAnsi="Times New Roman"/>
-        </w:rPr>
-        <w:t>&gt;Click Here&lt;/a&gt;</w:t>
+        <w:t>We can also link to our pages for example &lt;a href=”image.html”&gt;Click Here&lt;/a&gt;</w:t>
       </w:r>
     </w:p>
     <w:p>
@@ -891,57 +722,32 @@
           <w:szCs w:val="20"/>
         </w:rPr>
         <w:tab/>
-        <w:t>&lt;</w:t>
-      </w:r>
-      <w:proofErr w:type="spellStart"/>
-      <w:r>
-        <w:rPr>
-          <w:rFonts w:ascii="Times New Roman" w:hAnsi="Times New Roman"/>
-          <w:sz w:val="20"/>
-          <w:szCs w:val="20"/>
-        </w:rPr>
-        <w:t>thead</w:t>
-      </w:r>
-      <w:proofErr w:type="spellEnd"/>
-      <w:r>
-        <w:rPr>
-          <w:rFonts w:ascii="Times New Roman" w:hAnsi="Times New Roman"/>
-          <w:sz w:val="20"/>
-          <w:szCs w:val="20"/>
-        </w:rPr>
-        <w:t>&gt;</w:t>
-      </w:r>
-    </w:p>
-    <w:p>
-      <w:pPr>
-        <w:rPr>
-          <w:rFonts w:ascii="Times New Roman" w:hAnsi="Times New Roman"/>
-          <w:sz w:val="20"/>
-          <w:szCs w:val="20"/>
-        </w:rPr>
-      </w:pPr>
-      <w:r>
-        <w:rPr>
-          <w:rFonts w:ascii="Times New Roman" w:hAnsi="Times New Roman"/>
-          <w:sz w:val="20"/>
-          <w:szCs w:val="20"/>
-        </w:rPr>
-        <w:tab/>
-      </w:r>
-      <w:r>
-        <w:rPr>
-          <w:rFonts w:ascii="Times New Roman" w:hAnsi="Times New Roman"/>
-          <w:sz w:val="20"/>
-          <w:szCs w:val="20"/>
-        </w:rPr>
-        <w:tab/>
-      </w:r>
-      <w:r>
-        <w:rPr>
-          <w:rFonts w:ascii="Times New Roman" w:hAnsi="Times New Roman"/>
-          <w:sz w:val="20"/>
-          <w:szCs w:val="20"/>
-        </w:rPr>
+        <w:t>&lt;thead&gt;</w:t>
+      </w:r>
+    </w:p>
+    <w:p>
+      <w:pPr>
+        <w:rPr>
+          <w:rFonts w:ascii="Times New Roman" w:hAnsi="Times New Roman"/>
+          <w:sz w:val="20"/>
+          <w:szCs w:val="20"/>
+        </w:rPr>
+      </w:pPr>
+      <w:r>
+        <w:rPr>
+          <w:rFonts w:ascii="Times New Roman" w:hAnsi="Times New Roman"/>
+          <w:sz w:val="20"/>
+          <w:szCs w:val="20"/>
+        </w:rPr>
+        <w:tab/>
+      </w:r>
+      <w:r>
+        <w:rPr>
+          <w:rFonts w:ascii="Times New Roman" w:hAnsi="Times New Roman"/>
+          <w:sz w:val="20"/>
+          <w:szCs w:val="20"/>
+        </w:rPr>
+        <w:tab/>
         <w:t>&lt;tr&gt;</w:t>
       </w:r>
     </w:p>
@@ -976,304 +782,137 @@
           <w:szCs w:val="20"/>
         </w:rPr>
         <w:tab/>
-        <w:t>&lt;</w:t>
-      </w:r>
-      <w:proofErr w:type="spellStart"/>
-      <w:r>
-        <w:rPr>
-          <w:rFonts w:ascii="Times New Roman" w:hAnsi="Times New Roman"/>
-          <w:sz w:val="20"/>
-          <w:szCs w:val="20"/>
-        </w:rPr>
-        <w:t>th</w:t>
-      </w:r>
-      <w:proofErr w:type="spellEnd"/>
-      <w:r>
-        <w:rPr>
-          <w:rFonts w:ascii="Times New Roman" w:hAnsi="Times New Roman"/>
-          <w:sz w:val="20"/>
-          <w:szCs w:val="20"/>
-        </w:rPr>
-        <w:t>&gt;Ocean&lt;/</w:t>
-      </w:r>
-      <w:proofErr w:type="spellStart"/>
-      <w:r>
-        <w:rPr>
-          <w:rFonts w:ascii="Times New Roman" w:hAnsi="Times New Roman"/>
-          <w:sz w:val="20"/>
-          <w:szCs w:val="20"/>
-        </w:rPr>
-        <w:t>th</w:t>
-      </w:r>
-      <w:proofErr w:type="spellEnd"/>
-      <w:r>
-        <w:rPr>
-          <w:rFonts w:ascii="Times New Roman" w:hAnsi="Times New Roman"/>
-          <w:sz w:val="20"/>
-          <w:szCs w:val="20"/>
-        </w:rPr>
-        <w:t>&gt;</w:t>
-      </w:r>
-    </w:p>
-    <w:p>
-      <w:pPr>
-        <w:rPr>
-          <w:rFonts w:ascii="Times New Roman" w:hAnsi="Times New Roman"/>
-          <w:sz w:val="20"/>
-          <w:szCs w:val="20"/>
-        </w:rPr>
-      </w:pPr>
-      <w:r>
-        <w:rPr>
-          <w:rFonts w:ascii="Times New Roman" w:hAnsi="Times New Roman"/>
-          <w:sz w:val="20"/>
-          <w:szCs w:val="20"/>
-        </w:rPr>
-        <w:tab/>
-      </w:r>
-      <w:r>
-        <w:rPr>
-          <w:rFonts w:ascii="Times New Roman" w:hAnsi="Times New Roman"/>
-          <w:sz w:val="20"/>
-          <w:szCs w:val="20"/>
-        </w:rPr>
-        <w:tab/>
-      </w:r>
-      <w:r>
-        <w:rPr>
-          <w:rFonts w:ascii="Times New Roman" w:hAnsi="Times New Roman"/>
-          <w:sz w:val="20"/>
-          <w:szCs w:val="20"/>
-        </w:rPr>
-        <w:tab/>
-        <w:t>&lt;</w:t>
-      </w:r>
-      <w:proofErr w:type="spellStart"/>
-      <w:r>
-        <w:rPr>
-          <w:rFonts w:ascii="Times New Roman" w:hAnsi="Times New Roman"/>
-          <w:sz w:val="20"/>
-          <w:szCs w:val="20"/>
-        </w:rPr>
-        <w:t>th</w:t>
-      </w:r>
-      <w:proofErr w:type="spellEnd"/>
-      <w:r>
-        <w:rPr>
-          <w:rFonts w:ascii="Times New Roman" w:hAnsi="Times New Roman"/>
-          <w:sz w:val="20"/>
-          <w:szCs w:val="20"/>
-        </w:rPr>
-        <w:t>&gt;Average Depth&lt;/</w:t>
-      </w:r>
-      <w:proofErr w:type="spellStart"/>
-      <w:r>
-        <w:rPr>
-          <w:rFonts w:ascii="Times New Roman" w:hAnsi="Times New Roman"/>
-          <w:sz w:val="20"/>
-          <w:szCs w:val="20"/>
-        </w:rPr>
-        <w:t>th</w:t>
-      </w:r>
-      <w:proofErr w:type="spellEnd"/>
-      <w:r>
-        <w:rPr>
-          <w:rFonts w:ascii="Times New Roman" w:hAnsi="Times New Roman"/>
-          <w:sz w:val="20"/>
-          <w:szCs w:val="20"/>
-        </w:rPr>
-        <w:t>&gt;</w:t>
-      </w:r>
-    </w:p>
-    <w:p>
-      <w:pPr>
-        <w:rPr>
-          <w:rFonts w:ascii="Times New Roman" w:hAnsi="Times New Roman"/>
-          <w:sz w:val="20"/>
-          <w:szCs w:val="20"/>
-        </w:rPr>
-      </w:pPr>
-      <w:r>
-        <w:rPr>
-          <w:rFonts w:ascii="Times New Roman" w:hAnsi="Times New Roman"/>
-          <w:sz w:val="20"/>
-          <w:szCs w:val="20"/>
-        </w:rPr>
-        <w:tab/>
-      </w:r>
-      <w:r>
-        <w:rPr>
-          <w:rFonts w:ascii="Times New Roman" w:hAnsi="Times New Roman"/>
-          <w:sz w:val="20"/>
-          <w:szCs w:val="20"/>
-        </w:rPr>
-        <w:tab/>
-      </w:r>
-      <w:r>
-        <w:rPr>
-          <w:rFonts w:ascii="Times New Roman" w:hAnsi="Times New Roman"/>
-          <w:sz w:val="20"/>
-          <w:szCs w:val="20"/>
-        </w:rPr>
-        <w:tab/>
-        <w:t>&lt;</w:t>
-      </w:r>
-      <w:proofErr w:type="spellStart"/>
-      <w:r>
-        <w:rPr>
-          <w:rFonts w:ascii="Times New Roman" w:hAnsi="Times New Roman"/>
-          <w:sz w:val="20"/>
-          <w:szCs w:val="20"/>
-        </w:rPr>
-        <w:t>th</w:t>
-      </w:r>
-      <w:proofErr w:type="spellEnd"/>
-      <w:r>
-        <w:rPr>
-          <w:rFonts w:ascii="Times New Roman" w:hAnsi="Times New Roman"/>
-          <w:sz w:val="20"/>
-          <w:szCs w:val="20"/>
-        </w:rPr>
-        <w:t>&gt;Maximum Depth&lt;/</w:t>
-      </w:r>
-      <w:proofErr w:type="spellStart"/>
-      <w:r>
-        <w:rPr>
-          <w:rFonts w:ascii="Times New Roman" w:hAnsi="Times New Roman"/>
-          <w:sz w:val="20"/>
-          <w:szCs w:val="20"/>
-        </w:rPr>
-        <w:t>th</w:t>
-      </w:r>
-      <w:proofErr w:type="spellEnd"/>
-      <w:r>
-        <w:rPr>
-          <w:rFonts w:ascii="Times New Roman" w:hAnsi="Times New Roman"/>
-          <w:sz w:val="20"/>
-          <w:szCs w:val="20"/>
-        </w:rPr>
-        <w:t>&gt;</w:t>
-      </w:r>
-    </w:p>
-    <w:p>
-      <w:pPr>
-        <w:rPr>
-          <w:rFonts w:ascii="Times New Roman" w:hAnsi="Times New Roman"/>
-          <w:sz w:val="20"/>
-          <w:szCs w:val="20"/>
-        </w:rPr>
-      </w:pPr>
-      <w:r>
-        <w:rPr>
-          <w:rFonts w:ascii="Times New Roman" w:hAnsi="Times New Roman"/>
-          <w:sz w:val="20"/>
-          <w:szCs w:val="20"/>
-        </w:rPr>
-        <w:tab/>
-      </w:r>
-      <w:r>
-        <w:rPr>
-          <w:rFonts w:ascii="Times New Roman" w:hAnsi="Times New Roman"/>
-          <w:sz w:val="20"/>
-          <w:szCs w:val="20"/>
-        </w:rPr>
-        <w:tab/>
-      </w:r>
-      <w:r>
-        <w:rPr>
-          <w:rFonts w:ascii="Times New Roman" w:hAnsi="Times New Roman"/>
-          <w:sz w:val="20"/>
-          <w:szCs w:val="20"/>
-        </w:rPr>
-        <w:t>&lt;</w:t>
-      </w:r>
-      <w:r>
-        <w:rPr>
-          <w:rFonts w:ascii="Times New Roman" w:hAnsi="Times New Roman"/>
-          <w:sz w:val="20"/>
-          <w:szCs w:val="20"/>
-        </w:rPr>
-        <w:t>/</w:t>
-      </w:r>
-      <w:r>
-        <w:rPr>
-          <w:rFonts w:ascii="Times New Roman" w:hAnsi="Times New Roman"/>
-          <w:sz w:val="20"/>
-          <w:szCs w:val="20"/>
-        </w:rPr>
-        <w:t>tr&gt;</w:t>
-      </w:r>
-    </w:p>
-    <w:p>
-      <w:pPr>
-        <w:rPr>
-          <w:rFonts w:ascii="Times New Roman" w:hAnsi="Times New Roman"/>
-          <w:sz w:val="20"/>
-          <w:szCs w:val="20"/>
-        </w:rPr>
-      </w:pPr>
-      <w:r>
-        <w:rPr>
-          <w:rFonts w:ascii="Times New Roman" w:hAnsi="Times New Roman"/>
-          <w:sz w:val="20"/>
-          <w:szCs w:val="20"/>
-        </w:rPr>
-        <w:tab/>
-        <w:t>&lt;/</w:t>
-      </w:r>
-      <w:proofErr w:type="spellStart"/>
-      <w:r>
-        <w:rPr>
-          <w:rFonts w:ascii="Times New Roman" w:hAnsi="Times New Roman"/>
-          <w:sz w:val="20"/>
-          <w:szCs w:val="20"/>
-        </w:rPr>
-        <w:t>thead</w:t>
-      </w:r>
-      <w:proofErr w:type="spellEnd"/>
-      <w:r>
-        <w:rPr>
-          <w:rFonts w:ascii="Times New Roman" w:hAnsi="Times New Roman"/>
-          <w:sz w:val="20"/>
-          <w:szCs w:val="20"/>
-        </w:rPr>
-        <w:t>&gt;</w:t>
-      </w:r>
-    </w:p>
-    <w:p>
-      <w:pPr>
-        <w:rPr>
-          <w:rFonts w:ascii="Times New Roman" w:hAnsi="Times New Roman"/>
-          <w:sz w:val="20"/>
-          <w:szCs w:val="20"/>
-        </w:rPr>
-      </w:pPr>
-      <w:r>
-        <w:rPr>
-          <w:rFonts w:ascii="Times New Roman" w:hAnsi="Times New Roman"/>
-          <w:sz w:val="20"/>
-          <w:szCs w:val="20"/>
-        </w:rPr>
-        <w:tab/>
-        <w:t>&lt;</w:t>
-      </w:r>
-      <w:proofErr w:type="spellStart"/>
-      <w:r>
-        <w:rPr>
-          <w:rFonts w:ascii="Times New Roman" w:hAnsi="Times New Roman"/>
-          <w:sz w:val="20"/>
-          <w:szCs w:val="20"/>
-        </w:rPr>
-        <w:t>tbody</w:t>
-      </w:r>
-      <w:proofErr w:type="spellEnd"/>
-      <w:r>
-        <w:rPr>
-          <w:rFonts w:ascii="Times New Roman" w:hAnsi="Times New Roman"/>
-          <w:sz w:val="20"/>
-          <w:szCs w:val="20"/>
-        </w:rPr>
-        <w:t>&gt;</w:t>
+        <w:t>&lt;th&gt;Ocean&lt;/th&gt;</w:t>
+      </w:r>
+    </w:p>
+    <w:p>
+      <w:pPr>
+        <w:rPr>
+          <w:rFonts w:ascii="Times New Roman" w:hAnsi="Times New Roman"/>
+          <w:sz w:val="20"/>
+          <w:szCs w:val="20"/>
+        </w:rPr>
+      </w:pPr>
+      <w:r>
+        <w:rPr>
+          <w:rFonts w:ascii="Times New Roman" w:hAnsi="Times New Roman"/>
+          <w:sz w:val="20"/>
+          <w:szCs w:val="20"/>
+        </w:rPr>
+        <w:tab/>
+      </w:r>
+      <w:r>
+        <w:rPr>
+          <w:rFonts w:ascii="Times New Roman" w:hAnsi="Times New Roman"/>
+          <w:sz w:val="20"/>
+          <w:szCs w:val="20"/>
+        </w:rPr>
+        <w:tab/>
+      </w:r>
+      <w:r>
+        <w:rPr>
+          <w:rFonts w:ascii="Times New Roman" w:hAnsi="Times New Roman"/>
+          <w:sz w:val="20"/>
+          <w:szCs w:val="20"/>
+        </w:rPr>
+        <w:tab/>
+        <w:t>&lt;th&gt;Average Depth&lt;/th&gt;</w:t>
+      </w:r>
+    </w:p>
+    <w:p>
+      <w:pPr>
+        <w:rPr>
+          <w:rFonts w:ascii="Times New Roman" w:hAnsi="Times New Roman"/>
+          <w:sz w:val="20"/>
+          <w:szCs w:val="20"/>
+        </w:rPr>
+      </w:pPr>
+      <w:r>
+        <w:rPr>
+          <w:rFonts w:ascii="Times New Roman" w:hAnsi="Times New Roman"/>
+          <w:sz w:val="20"/>
+          <w:szCs w:val="20"/>
+        </w:rPr>
+        <w:tab/>
+      </w:r>
+      <w:r>
+        <w:rPr>
+          <w:rFonts w:ascii="Times New Roman" w:hAnsi="Times New Roman"/>
+          <w:sz w:val="20"/>
+          <w:szCs w:val="20"/>
+        </w:rPr>
+        <w:tab/>
+      </w:r>
+      <w:r>
+        <w:rPr>
+          <w:rFonts w:ascii="Times New Roman" w:hAnsi="Times New Roman"/>
+          <w:sz w:val="20"/>
+          <w:szCs w:val="20"/>
+        </w:rPr>
+        <w:tab/>
+        <w:t>&lt;th&gt;Maximum Depth&lt;/th&gt;</w:t>
+      </w:r>
+    </w:p>
+    <w:p>
+      <w:pPr>
+        <w:rPr>
+          <w:rFonts w:ascii="Times New Roman" w:hAnsi="Times New Roman"/>
+          <w:sz w:val="20"/>
+          <w:szCs w:val="20"/>
+        </w:rPr>
+      </w:pPr>
+      <w:r>
+        <w:rPr>
+          <w:rFonts w:ascii="Times New Roman" w:hAnsi="Times New Roman"/>
+          <w:sz w:val="20"/>
+          <w:szCs w:val="20"/>
+        </w:rPr>
+        <w:tab/>
+      </w:r>
+      <w:r>
+        <w:rPr>
+          <w:rFonts w:ascii="Times New Roman" w:hAnsi="Times New Roman"/>
+          <w:sz w:val="20"/>
+          <w:szCs w:val="20"/>
+        </w:rPr>
+        <w:tab/>
+        <w:t>&lt;/tr&gt;</w:t>
+      </w:r>
+    </w:p>
+    <w:p>
+      <w:pPr>
+        <w:rPr>
+          <w:rFonts w:ascii="Times New Roman" w:hAnsi="Times New Roman"/>
+          <w:sz w:val="20"/>
+          <w:szCs w:val="20"/>
+        </w:rPr>
+      </w:pPr>
+      <w:r>
+        <w:rPr>
+          <w:rFonts w:ascii="Times New Roman" w:hAnsi="Times New Roman"/>
+          <w:sz w:val="20"/>
+          <w:szCs w:val="20"/>
+        </w:rPr>
+        <w:tab/>
+        <w:t>&lt;/thead&gt;</w:t>
+      </w:r>
+    </w:p>
+    <w:p>
+      <w:pPr>
+        <w:rPr>
+          <w:rFonts w:ascii="Times New Roman" w:hAnsi="Times New Roman"/>
+          <w:sz w:val="20"/>
+          <w:szCs w:val="20"/>
+        </w:rPr>
+      </w:pPr>
+      <w:r>
+        <w:rPr>
+          <w:rFonts w:ascii="Times New Roman" w:hAnsi="Times New Roman"/>
+          <w:sz w:val="20"/>
+          <w:szCs w:val="20"/>
+        </w:rPr>
+        <w:tab/>
+        <w:t>&lt;tbody&gt;</w:t>
       </w:r>
     </w:p>
     <w:p>
@@ -1487,125 +1126,75 @@
           <w:szCs w:val="20"/>
         </w:rPr>
         <w:tab/>
-        <w:t>&lt;td&gt;</w:t>
-      </w:r>
-      <w:proofErr w:type="spellStart"/>
-      <w:r>
-        <w:rPr>
-          <w:rFonts w:ascii="Times New Roman" w:hAnsi="Times New Roman"/>
-          <w:sz w:val="20"/>
-          <w:szCs w:val="20"/>
-        </w:rPr>
-        <w:t>Atalntic</w:t>
-      </w:r>
-      <w:proofErr w:type="spellEnd"/>
-      <w:r>
-        <w:rPr>
-          <w:rFonts w:ascii="Times New Roman" w:hAnsi="Times New Roman"/>
-          <w:sz w:val="20"/>
-          <w:szCs w:val="20"/>
-        </w:rPr>
-        <w:t xml:space="preserve"> Ocean&lt;/td&gt;</w:t>
-      </w:r>
-    </w:p>
-    <w:p>
-      <w:pPr>
-        <w:rPr>
-          <w:rFonts w:ascii="Times New Roman" w:hAnsi="Times New Roman"/>
-          <w:sz w:val="20"/>
-          <w:szCs w:val="20"/>
-        </w:rPr>
-      </w:pPr>
-      <w:r>
-        <w:rPr>
-          <w:rFonts w:ascii="Times New Roman" w:hAnsi="Times New Roman"/>
-          <w:sz w:val="20"/>
-          <w:szCs w:val="20"/>
-        </w:rPr>
-        <w:tab/>
-      </w:r>
-      <w:r>
-        <w:rPr>
-          <w:rFonts w:ascii="Times New Roman" w:hAnsi="Times New Roman"/>
-          <w:sz w:val="20"/>
-          <w:szCs w:val="20"/>
-        </w:rPr>
-        <w:tab/>
-      </w:r>
-      <w:r>
-        <w:rPr>
-          <w:rFonts w:ascii="Times New Roman" w:hAnsi="Times New Roman"/>
-          <w:sz w:val="20"/>
-          <w:szCs w:val="20"/>
-        </w:rPr>
-        <w:tab/>
-        <w:t>&lt;td&gt;</w:t>
-      </w:r>
-      <w:r>
-        <w:rPr>
-          <w:rFonts w:ascii="Times New Roman" w:hAnsi="Times New Roman"/>
-          <w:sz w:val="20"/>
-          <w:szCs w:val="20"/>
-        </w:rPr>
-        <w:t>3,646</w:t>
-      </w:r>
-      <w:r>
-        <w:rPr>
-          <w:rFonts w:ascii="Times New Roman" w:hAnsi="Times New Roman"/>
-          <w:sz w:val="20"/>
-          <w:szCs w:val="20"/>
-        </w:rPr>
-        <w:t xml:space="preserve"> m&lt;/td&gt;</w:t>
-      </w:r>
-    </w:p>
-    <w:p>
-      <w:pPr>
-        <w:rPr>
-          <w:rFonts w:ascii="Times New Roman" w:hAnsi="Times New Roman"/>
-          <w:sz w:val="20"/>
-          <w:szCs w:val="20"/>
-        </w:rPr>
-      </w:pPr>
-      <w:r>
-        <w:rPr>
-          <w:rFonts w:ascii="Times New Roman" w:hAnsi="Times New Roman"/>
-          <w:sz w:val="20"/>
-          <w:szCs w:val="20"/>
-        </w:rPr>
-        <w:tab/>
-      </w:r>
-      <w:r>
-        <w:rPr>
-          <w:rFonts w:ascii="Times New Roman" w:hAnsi="Times New Roman"/>
-          <w:sz w:val="20"/>
-          <w:szCs w:val="20"/>
-        </w:rPr>
-        <w:tab/>
-      </w:r>
-      <w:r>
-        <w:rPr>
-          <w:rFonts w:ascii="Times New Roman" w:hAnsi="Times New Roman"/>
-          <w:sz w:val="20"/>
-          <w:szCs w:val="20"/>
-        </w:rPr>
-        <w:tab/>
-        <w:t>&lt;td&gt;</w:t>
-      </w:r>
-      <w:r>
-        <w:rPr>
-          <w:rFonts w:ascii="Times New Roman" w:hAnsi="Times New Roman"/>
-          <w:sz w:val="20"/>
-          <w:szCs w:val="20"/>
-        </w:rPr>
-        <w:t xml:space="preserve">8,466 </w:t>
-      </w:r>
-      <w:r>
-        <w:rPr>
-          <w:rFonts w:ascii="Times New Roman" w:hAnsi="Times New Roman"/>
-          <w:sz w:val="20"/>
-          <w:szCs w:val="20"/>
-        </w:rPr>
-        <w:t>m&lt;/td&gt;</w:t>
+        <w:t>&lt;td&gt;Atalntic Ocean&lt;/td&gt;</w:t>
+      </w:r>
+    </w:p>
+    <w:p>
+      <w:pPr>
+        <w:rPr>
+          <w:rFonts w:ascii="Times New Roman" w:hAnsi="Times New Roman"/>
+          <w:sz w:val="20"/>
+          <w:szCs w:val="20"/>
+        </w:rPr>
+      </w:pPr>
+      <w:r>
+        <w:rPr>
+          <w:rFonts w:ascii="Times New Roman" w:hAnsi="Times New Roman"/>
+          <w:sz w:val="20"/>
+          <w:szCs w:val="20"/>
+        </w:rPr>
+        <w:tab/>
+      </w:r>
+      <w:r>
+        <w:rPr>
+          <w:rFonts w:ascii="Times New Roman" w:hAnsi="Times New Roman"/>
+          <w:sz w:val="20"/>
+          <w:szCs w:val="20"/>
+        </w:rPr>
+        <w:tab/>
+      </w:r>
+      <w:r>
+        <w:rPr>
+          <w:rFonts w:ascii="Times New Roman" w:hAnsi="Times New Roman"/>
+          <w:sz w:val="20"/>
+          <w:szCs w:val="20"/>
+        </w:rPr>
+        <w:tab/>
+        <w:t>&lt;td&gt;3,646 m&lt;/td&gt;</w:t>
+      </w:r>
+    </w:p>
+    <w:p>
+      <w:pPr>
+        <w:rPr>
+          <w:rFonts w:ascii="Times New Roman" w:hAnsi="Times New Roman"/>
+          <w:sz w:val="20"/>
+          <w:szCs w:val="20"/>
+        </w:rPr>
+      </w:pPr>
+      <w:r>
+        <w:rPr>
+          <w:rFonts w:ascii="Times New Roman" w:hAnsi="Times New Roman"/>
+          <w:sz w:val="20"/>
+          <w:szCs w:val="20"/>
+        </w:rPr>
+        <w:tab/>
+      </w:r>
+      <w:r>
+        <w:rPr>
+          <w:rFonts w:ascii="Times New Roman" w:hAnsi="Times New Roman"/>
+          <w:sz w:val="20"/>
+          <w:szCs w:val="20"/>
+        </w:rPr>
+        <w:tab/>
+      </w:r>
+      <w:r>
+        <w:rPr>
+          <w:rFonts w:ascii="Times New Roman" w:hAnsi="Times New Roman"/>
+          <w:sz w:val="20"/>
+          <w:szCs w:val="20"/>
+        </w:rPr>
+        <w:tab/>
+        <w:t>&lt;td&gt;8,466 m&lt;/td&gt;</w:t>
       </w:r>
     </w:p>
     <w:p>
@@ -1674,25 +1263,7 @@
           <w:szCs w:val="20"/>
         </w:rPr>
         <w:tab/>
-        <w:t>&lt;/</w:t>
-      </w:r>
-      <w:proofErr w:type="spellStart"/>
-      <w:r>
-        <w:rPr>
-          <w:rFonts w:ascii="Times New Roman" w:hAnsi="Times New Roman"/>
-          <w:sz w:val="20"/>
-          <w:szCs w:val="20"/>
-        </w:rPr>
-        <w:t>tbody</w:t>
-      </w:r>
-      <w:proofErr w:type="spellEnd"/>
-      <w:r>
-        <w:rPr>
-          <w:rFonts w:ascii="Times New Roman" w:hAnsi="Times New Roman"/>
-          <w:sz w:val="20"/>
-          <w:szCs w:val="20"/>
-        </w:rPr>
-        <w:t>&gt;</w:t>
+        <w:t>&lt;/tbody&gt;</w:t>
       </w:r>
     </w:p>
     <w:p>
@@ -1743,104 +1314,32 @@
           <w:sz w:val="20"/>
           <w:szCs w:val="20"/>
         </w:rPr>
-        <w:t>&lt;</w:t>
-      </w:r>
-      <w:proofErr w:type="spellStart"/>
-      <w:r>
-        <w:rPr>
-          <w:rFonts w:ascii="Times New Roman" w:hAnsi="Times New Roman"/>
-          <w:sz w:val="20"/>
-          <w:szCs w:val="20"/>
-        </w:rPr>
-        <w:t>thead</w:t>
-      </w:r>
-      <w:proofErr w:type="spellEnd"/>
-      <w:r>
-        <w:rPr>
-          <w:rFonts w:ascii="Times New Roman" w:hAnsi="Times New Roman"/>
-          <w:sz w:val="20"/>
-          <w:szCs w:val="20"/>
-        </w:rPr>
-        <w:t>&gt;&lt;/</w:t>
-      </w:r>
-      <w:proofErr w:type="spellStart"/>
-      <w:r>
-        <w:rPr>
-          <w:rFonts w:ascii="Times New Roman" w:hAnsi="Times New Roman"/>
-          <w:sz w:val="20"/>
-          <w:szCs w:val="20"/>
-        </w:rPr>
-        <w:t>thead</w:t>
-      </w:r>
-      <w:proofErr w:type="spellEnd"/>
-      <w:r>
-        <w:rPr>
-          <w:rFonts w:ascii="Times New Roman" w:hAnsi="Times New Roman"/>
-          <w:sz w:val="20"/>
-          <w:szCs w:val="20"/>
-        </w:rPr>
-        <w:t xml:space="preserve">&gt; table header </w:t>
-      </w:r>
-    </w:p>
-    <w:p>
-      <w:pPr>
-        <w:rPr>
-          <w:rFonts w:ascii="Times New Roman" w:hAnsi="Times New Roman"/>
-          <w:sz w:val="20"/>
-          <w:szCs w:val="20"/>
-        </w:rPr>
-      </w:pPr>
-      <w:r>
-        <w:rPr>
-          <w:rFonts w:ascii="Times New Roman" w:hAnsi="Times New Roman"/>
-          <w:sz w:val="20"/>
-          <w:szCs w:val="20"/>
-        </w:rPr>
-        <w:t>&lt;</w:t>
-      </w:r>
-      <w:proofErr w:type="spellStart"/>
-      <w:r>
-        <w:rPr>
-          <w:rFonts w:ascii="Times New Roman" w:hAnsi="Times New Roman"/>
-          <w:sz w:val="20"/>
-          <w:szCs w:val="20"/>
-        </w:rPr>
-        <w:t>tbody</w:t>
-      </w:r>
-      <w:proofErr w:type="spellEnd"/>
-      <w:r>
-        <w:rPr>
-          <w:rFonts w:ascii="Times New Roman" w:hAnsi="Times New Roman"/>
-          <w:sz w:val="20"/>
-          <w:szCs w:val="20"/>
-        </w:rPr>
-        <w:t>&gt;</w:t>
-      </w:r>
-      <w:r>
-        <w:rPr>
-          <w:rFonts w:ascii="Times New Roman" w:hAnsi="Times New Roman"/>
-          <w:sz w:val="20"/>
-          <w:szCs w:val="20"/>
-        </w:rPr>
-        <w:t>&lt;/</w:t>
-      </w:r>
-      <w:proofErr w:type="spellStart"/>
-      <w:r>
-        <w:rPr>
-          <w:rFonts w:ascii="Times New Roman" w:hAnsi="Times New Roman"/>
-          <w:sz w:val="20"/>
-          <w:szCs w:val="20"/>
-        </w:rPr>
-        <w:t>tbody</w:t>
-      </w:r>
-      <w:proofErr w:type="spellEnd"/>
-      <w:r>
-        <w:rPr>
-          <w:rFonts w:ascii="Times New Roman" w:hAnsi="Times New Roman"/>
-          <w:sz w:val="20"/>
-          <w:szCs w:val="20"/>
-        </w:rPr>
-        <w:t>&gt; table body</w:t>
+        <w:t xml:space="preserve">&lt;thead&gt;&lt;/thead&gt; table header </w:t>
+      </w:r>
+    </w:p>
+    <w:p>
+      <w:pPr>
+        <w:rPr>
+          <w:rFonts w:ascii="Times New Roman" w:hAnsi="Times New Roman"/>
+          <w:sz w:val="20"/>
+          <w:szCs w:val="20"/>
+        </w:rPr>
+      </w:pPr>
+      <w:r>
+        <w:rPr>
+          <w:rFonts w:ascii="Times New Roman" w:hAnsi="Times New Roman"/>
+          <w:sz w:val="20"/>
+          <w:szCs w:val="20"/>
+        </w:rPr>
+        <w:t>&lt;tbody&gt;</w:t>
+      </w:r>
+      <w:r>
+        <w:rPr>
+          <w:rFonts w:ascii="Times New Roman" w:hAnsi="Times New Roman"/>
+          <w:sz w:val="20"/>
+          <w:szCs w:val="20"/>
+        </w:rPr>
+        <w:t>&lt;/tbody&gt; table body</w:t>
       </w:r>
     </w:p>
     <w:p>
@@ -1874,43 +1373,7 @@
           <w:sz w:val="20"/>
           <w:szCs w:val="20"/>
         </w:rPr>
-        <w:t>&lt;</w:t>
-      </w:r>
-      <w:proofErr w:type="spellStart"/>
-      <w:r>
-        <w:rPr>
-          <w:rFonts w:ascii="Times New Roman" w:hAnsi="Times New Roman"/>
-          <w:sz w:val="20"/>
-          <w:szCs w:val="20"/>
-        </w:rPr>
-        <w:t>th</w:t>
-      </w:r>
-      <w:proofErr w:type="spellEnd"/>
-      <w:r>
-        <w:rPr>
-          <w:rFonts w:ascii="Times New Roman" w:hAnsi="Times New Roman"/>
-          <w:sz w:val="20"/>
-          <w:szCs w:val="20"/>
-        </w:rPr>
-        <w:t>&gt;&lt;</w:t>
-      </w:r>
-      <w:proofErr w:type="spellStart"/>
-      <w:r>
-        <w:rPr>
-          <w:rFonts w:ascii="Times New Roman" w:hAnsi="Times New Roman"/>
-          <w:sz w:val="20"/>
-          <w:szCs w:val="20"/>
-        </w:rPr>
-        <w:t>th</w:t>
-      </w:r>
-      <w:proofErr w:type="spellEnd"/>
-      <w:r>
-        <w:rPr>
-          <w:rFonts w:ascii="Times New Roman" w:hAnsi="Times New Roman"/>
-          <w:sz w:val="20"/>
-          <w:szCs w:val="20"/>
-        </w:rPr>
-        <w:t>&gt; table header</w:t>
+        <w:t>&lt;th&gt;&lt;th&gt; table header</w:t>
       </w:r>
     </w:p>
     <w:p>
@@ -1970,8 +1433,1020 @@
           <w:rFonts w:ascii="Times New Roman" w:hAnsi="Times New Roman"/>
         </w:rPr>
       </w:pPr>
+      <w:r>
+        <w:rPr>
+          <w:rFonts w:ascii="Times New Roman" w:hAnsi="Times New Roman"/>
+        </w:rPr>
+        <w:t xml:space="preserve">&lt;form&gt; </w:t>
+      </w:r>
+    </w:p>
+    <w:p>
+      <w:pPr>
+        <w:rPr>
+          <w:rFonts w:ascii="Times New Roman" w:hAnsi="Times New Roman"/>
+        </w:rPr>
+      </w:pPr>
+      <w:r>
+        <w:rPr>
+          <w:rFonts w:ascii="Times New Roman" w:hAnsi="Times New Roman"/>
+        </w:rPr>
+        <w:tab/>
+        <w:t>&lt;input type = ”text” placeholder = “Full Name” name = “Full name” &gt;</w:t>
+      </w:r>
+    </w:p>
+    <w:p>
+      <w:pPr>
+        <w:rPr>
+          <w:rFonts w:ascii="Times New Roman" w:hAnsi="Times New Roman"/>
+        </w:rPr>
+      </w:pPr>
+      <w:r>
+        <w:rPr>
+          <w:rFonts w:ascii="Times New Roman" w:hAnsi="Times New Roman"/>
+        </w:rPr>
+        <w:tab/>
+        <w:t>&lt;input type = “submit”&gt;</w:t>
+      </w:r>
+    </w:p>
+    <w:p>
+      <w:pPr>
+        <w:rPr>
+          <w:rFonts w:ascii="Times New Roman" w:hAnsi="Times New Roman"/>
+        </w:rPr>
+      </w:pPr>
+      <w:r>
+        <w:rPr>
+          <w:rFonts w:ascii="Times New Roman" w:hAnsi="Times New Roman"/>
+        </w:rPr>
+        <w:t>&lt;/form&gt;</w:t>
+      </w:r>
+    </w:p>
+    <w:p>
+      <w:pPr>
+        <w:rPr>
+          <w:rFonts w:ascii="Times New Roman" w:hAnsi="Times New Roman"/>
+        </w:rPr>
+      </w:pPr>
+      <w:r>
+        <w:rPr>
+          <w:rFonts w:ascii="Times New Roman" w:hAnsi="Times New Roman"/>
+        </w:rPr>
+        <w:t>Type is for the type of form you have for example text field. Input filed submit is creating a button to work as a submit button.</w:t>
+      </w:r>
+    </w:p>
+    <w:p>
+      <w:pPr>
+        <w:rPr>
+          <w:rFonts w:ascii="Times New Roman" w:hAnsi="Times New Roman"/>
+        </w:rPr>
+      </w:pPr>
+      <w:r>
+        <w:rPr>
+          <w:rFonts w:ascii="Times New Roman" w:hAnsi="Times New Roman"/>
+        </w:rPr>
+        <w:t>Placeholder is the description or the instruction of what you should write in the form input.</w:t>
+      </w:r>
+    </w:p>
+    <w:p>
+      <w:pPr>
+        <w:rPr>
+          <w:rFonts w:ascii="Times New Roman" w:hAnsi="Times New Roman"/>
+        </w:rPr>
+      </w:pPr>
+      <w:r>
+        <w:rPr>
+          <w:rFonts w:ascii="Times New Roman" w:hAnsi="Times New Roman"/>
+        </w:rPr>
+        <w:t>Name is the description of the form/input.</w:t>
+      </w:r>
+    </w:p>
+    <w:p>
+      <w:pPr>
+        <w:rPr>
+          <w:rFonts w:ascii="Times New Roman" w:hAnsi="Times New Roman"/>
+        </w:rPr>
+      </w:pPr>
+      <w:r>
+        <w:rPr>
+          <w:rFonts w:ascii="Times New Roman" w:hAnsi="Times New Roman"/>
+        </w:rPr>
+        <w:t>Other example of the input/forms:</w:t>
+      </w:r>
+    </w:p>
+    <w:p>
+      <w:pPr>
+        <w:rPr>
+          <w:rFonts w:ascii="Times New Roman" w:hAnsi="Times New Roman"/>
+        </w:rPr>
+      </w:pPr>
+      <w:r>
+        <w:rPr>
+          <w:rFonts w:ascii="Times New Roman" w:hAnsi="Times New Roman"/>
+        </w:rPr>
+        <w:t>&lt;input name = “password” type = “password” placeholder = “password”&gt;</w:t>
+      </w:r>
+    </w:p>
+    <w:p>
+      <w:pPr>
+        <w:pStyle w:val="ListParagraph"/>
+        <w:numPr>
+          <w:ilvl w:val="0"/>
+          <w:numId w:val="2"/>
+        </w:numPr>
+        <w:rPr>
+          <w:rFonts w:ascii="Times New Roman" w:hAnsi="Times New Roman"/>
+        </w:rPr>
+      </w:pPr>
+      <w:r>
+        <w:rPr>
+          <w:rFonts w:ascii="Times New Roman" w:hAnsi="Times New Roman"/>
+        </w:rPr>
+        <w:t>Div</w:t>
+      </w:r>
+    </w:p>
+    <w:p>
+      <w:pPr>
+        <w:rPr>
+          <w:rFonts w:ascii="Times New Roman" w:hAnsi="Times New Roman"/>
+        </w:rPr>
+      </w:pPr>
+      <w:r>
+        <w:rPr>
+          <w:rFonts w:ascii="Times New Roman" w:hAnsi="Times New Roman"/>
+        </w:rPr>
+        <w:t>&lt;div&gt;</w:t>
+      </w:r>
+    </w:p>
+    <w:p>
+      <w:pPr>
+        <w:rPr>
+          <w:rFonts w:ascii="Times New Roman" w:hAnsi="Times New Roman"/>
+        </w:rPr>
+      </w:pPr>
+      <w:r>
+        <w:rPr>
+          <w:rFonts w:ascii="Times New Roman" w:hAnsi="Times New Roman"/>
+        </w:rPr>
+        <w:tab/>
+        <w:t>Hello, World!</w:t>
+      </w:r>
+    </w:p>
+    <w:p>
+      <w:pPr>
+        <w:rPr>
+          <w:rFonts w:ascii="Times New Roman" w:hAnsi="Times New Roman"/>
+        </w:rPr>
+      </w:pPr>
+      <w:r>
+        <w:rPr>
+          <w:rFonts w:ascii="Times New Roman" w:hAnsi="Times New Roman"/>
+        </w:rPr>
+        <w:t>&lt;/div&gt;</w:t>
+      </w:r>
+    </w:p>
+    <w:p>
+      <w:pPr>
+        <w:rPr>
+          <w:rFonts w:ascii="Times New Roman" w:hAnsi="Times New Roman"/>
+        </w:rPr>
+      </w:pPr>
+      <w:r>
+        <w:rPr>
+          <w:rFonts w:ascii="Times New Roman" w:hAnsi="Times New Roman"/>
+        </w:rPr>
+        <w:t>Div is a division of the page.</w:t>
+      </w:r>
+    </w:p>
+    <w:p>
+      <w:pPr>
+        <w:pStyle w:val="ListParagraph"/>
+        <w:numPr>
+          <w:ilvl w:val="0"/>
+          <w:numId w:val="2"/>
+        </w:numPr>
+        <w:rPr>
+          <w:rFonts w:ascii="Times New Roman" w:hAnsi="Times New Roman"/>
+        </w:rPr>
+      </w:pPr>
+      <w:r>
+        <w:rPr>
+          <w:rFonts w:ascii="Times New Roman" w:hAnsi="Times New Roman"/>
+        </w:rPr>
+        <w:t>HTML IDs</w:t>
+      </w:r>
+    </w:p>
+    <w:p>
+      <w:pPr>
+        <w:rPr>
+          <w:rFonts w:ascii="Times New Roman" w:hAnsi="Times New Roman"/>
+        </w:rPr>
+      </w:pPr>
+      <w:r>
+        <w:rPr>
+          <w:rFonts w:ascii="Times New Roman" w:hAnsi="Times New Roman"/>
+        </w:rPr>
+        <w:t>You can give html elements their ID.</w:t>
+      </w:r>
+    </w:p>
+    <w:p>
+      <w:pPr>
+        <w:rPr>
+          <w:rFonts w:ascii="Times New Roman" w:hAnsi="Times New Roman"/>
+        </w:rPr>
+      </w:pPr>
+      <w:r>
+        <w:rPr>
+          <w:rFonts w:ascii="Times New Roman" w:hAnsi="Times New Roman"/>
+        </w:rPr>
+        <w:t>For example, &lt;h1 id=”one”&gt; Heading &lt;/h1&gt;</w:t>
+      </w:r>
+    </w:p>
+    <w:p>
+      <w:pPr>
+        <w:rPr>
+          <w:rFonts w:ascii="Times New Roman" w:hAnsi="Times New Roman"/>
+        </w:rPr>
+      </w:pPr>
+      <w:r>
+        <w:rPr>
+          <w:rFonts w:ascii="Times New Roman" w:hAnsi="Times New Roman"/>
+        </w:rPr>
+        <w:t>Is easier this way to change or keep the track of specific elements.</w:t>
+      </w:r>
+    </w:p>
+    <w:p>
+      <w:pPr>
+        <w:rPr>
+          <w:rFonts w:ascii="Times New Roman" w:hAnsi="Times New Roman"/>
+        </w:rPr>
+      </w:pPr>
+    </w:p>
+    <w:p>
+      <w:pPr>
+        <w:pStyle w:val="ListParagraph"/>
+        <w:numPr>
+          <w:ilvl w:val="0"/>
+          <w:numId w:val="2"/>
+        </w:numPr>
+        <w:rPr>
+          <w:rFonts w:ascii="Times New Roman" w:hAnsi="Times New Roman"/>
+        </w:rPr>
+      </w:pPr>
+      <w:r>
+        <w:rPr>
+          <w:rFonts w:ascii="Times New Roman" w:hAnsi="Times New Roman"/>
+        </w:rPr>
+        <w:t>Class</w:t>
+      </w:r>
+    </w:p>
+    <w:p>
+      <w:pPr>
+        <w:rPr>
+          <w:rFonts w:ascii="Times New Roman" w:hAnsi="Times New Roman"/>
+        </w:rPr>
+      </w:pPr>
+      <w:r>
+        <w:rPr>
+          <w:rFonts w:ascii="Times New Roman" w:hAnsi="Times New Roman"/>
+        </w:rPr>
+        <w:t>Like IDs they mostly work the same BUT the main difference is that CLASS ARE NOT UNIC LIKE IDs they can be used for multiple elements to keep better track of them.</w:t>
+      </w:r>
+    </w:p>
+    <w:p>
+      <w:pPr>
+        <w:rPr>
+          <w:rFonts w:ascii="Times New Roman" w:hAnsi="Times New Roman"/>
+        </w:rPr>
+      </w:pPr>
+      <w:r>
+        <w:rPr>
+          <w:rFonts w:ascii="Times New Roman" w:hAnsi="Times New Roman"/>
+        </w:rPr>
+        <w:t>&lt;h1 class = “two”&gt; Heading 2 &lt;/h1&gt;</w:t>
+      </w:r>
+    </w:p>
+    <w:p>
+      <w:pPr>
+        <w:rPr>
+          <w:rFonts w:ascii="Times New Roman" w:hAnsi="Times New Roman"/>
+        </w:rPr>
+      </w:pPr>
+      <w:r>
+        <w:rPr>
+          <w:rFonts w:ascii="Times New Roman" w:hAnsi="Times New Roman"/>
+        </w:rPr>
+        <w:t>&lt;h2 class = “two”&gt; Heading 3 &lt;/h1&gt;</w:t>
+      </w:r>
+    </w:p>
+    <w:p>
+      <w:pPr>
+        <w:rPr>
+          <w:rFonts w:ascii="Times New Roman" w:hAnsi="Times New Roman"/>
+        </w:rPr>
+      </w:pPr>
+    </w:p>
+    <w:p>
+      <w:pPr>
+        <w:rPr>
+          <w:rFonts w:ascii="Times New Roman" w:hAnsi="Times New Roman"/>
+        </w:rPr>
+      </w:pPr>
+    </w:p>
+    <w:p>
+      <w:pPr>
+        <w:rPr>
+          <w:rFonts w:ascii="Times New Roman" w:hAnsi="Times New Roman"/>
+        </w:rPr>
+      </w:pPr>
+    </w:p>
+    <w:p>
+      <w:pPr>
+        <w:rPr>
+          <w:rFonts w:ascii="Times New Roman" w:hAnsi="Times New Roman"/>
+        </w:rPr>
+      </w:pPr>
+    </w:p>
+    <w:p>
+      <w:pPr>
+        <w:rPr>
+          <w:rFonts w:ascii="Times New Roman" w:hAnsi="Times New Roman"/>
+        </w:rPr>
+      </w:pPr>
+    </w:p>
+    <w:p>
+      <w:pPr>
+        <w:rPr>
+          <w:rFonts w:ascii="Times New Roman" w:hAnsi="Times New Roman"/>
+        </w:rPr>
+      </w:pPr>
+    </w:p>
+    <w:p>
+      <w:pPr>
+        <w:rPr>
+          <w:rFonts w:ascii="Times New Roman" w:hAnsi="Times New Roman"/>
+        </w:rPr>
+      </w:pPr>
+    </w:p>
+    <w:p>
+      <w:pPr>
+        <w:rPr>
+          <w:rFonts w:ascii="Times New Roman" w:hAnsi="Times New Roman"/>
+        </w:rPr>
+      </w:pPr>
+    </w:p>
+    <w:p>
+      <w:pPr>
+        <w:tabs>
+          <w:tab w:val="left" w:pos="1170"/>
+        </w:tabs>
+        <w:rPr>
+          <w:rFonts w:ascii="Times New Roman" w:hAnsi="Times New Roman"/>
+          <w:b/>
+          <w:bCs/>
+          <w:sz w:val="32"/>
+          <w:szCs w:val="32"/>
+        </w:rPr>
+      </w:pPr>
+      <w:r>
+        <w:rPr>
+          <w:rFonts w:ascii="Times New Roman" w:hAnsi="Times New Roman"/>
+          <w:b/>
+          <w:bCs/>
+          <w:sz w:val="32"/>
+          <w:szCs w:val="32"/>
+        </w:rPr>
+        <w:t>CSS:</w:t>
+      </w:r>
+      <w:r>
+        <w:rPr>
+          <w:rFonts w:ascii="Times New Roman" w:hAnsi="Times New Roman"/>
+          <w:b/>
+          <w:bCs/>
+          <w:sz w:val="32"/>
+          <w:szCs w:val="32"/>
+        </w:rPr>
+        <w:tab/>
+      </w:r>
+    </w:p>
+    <w:p>
+      <w:pPr>
+        <w:tabs>
+          <w:tab w:val="left" w:pos="1170"/>
+        </w:tabs>
+        <w:rPr>
+          <w:rFonts w:ascii="Times New Roman" w:hAnsi="Times New Roman"/>
+        </w:rPr>
+      </w:pPr>
+      <w:r>
+        <w:rPr>
+          <w:rFonts w:ascii="Times New Roman" w:hAnsi="Times New Roman"/>
+        </w:rPr>
+        <w:t>In-line styling:</w:t>
+      </w:r>
+    </w:p>
+    <w:p>
+      <w:pPr>
+        <w:rPr>
+          <w:rFonts w:ascii="Times New Roman" w:hAnsi="Times New Roman"/>
+        </w:rPr>
+      </w:pPr>
+      <w:r>
+        <w:rPr>
+          <w:rFonts w:ascii="Times New Roman" w:hAnsi="Times New Roman"/>
+          <w:b/>
+          <w:bCs/>
+        </w:rPr>
+        <w:t>&lt;</w:t>
+      </w:r>
+      <w:r>
+        <w:rPr>
+          <w:rFonts w:ascii="Times New Roman" w:hAnsi="Times New Roman"/>
+        </w:rPr>
+        <w:t xml:space="preserve">h1 </w:t>
+      </w:r>
+      <w:r>
+        <w:rPr>
+          <w:rFonts w:ascii="Times New Roman" w:hAnsi="Times New Roman"/>
+        </w:rPr>
+        <w:t>style = ”color: blue;”&gt;Welcome to my Web Page &lt;/h1&gt;</w:t>
+      </w:r>
+    </w:p>
+    <w:p>
+      <w:pPr>
+        <w:rPr>
+          <w:rFonts w:ascii="Times New Roman" w:hAnsi="Times New Roman"/>
+        </w:rPr>
+      </w:pPr>
+      <w:r>
+        <w:rPr>
+          <w:rFonts w:ascii="Times New Roman" w:hAnsi="Times New Roman"/>
+        </w:rPr>
+        <w:t>Use style and after that ad in the “” css attributes like color</w:t>
+      </w:r>
+      <w:r>
+        <w:rPr>
+          <w:rFonts w:ascii="Times New Roman" w:hAnsi="Times New Roman"/>
+        </w:rPr>
+        <w:t xml:space="preserve">, </w:t>
+      </w:r>
+      <w:r>
+        <w:rPr>
+          <w:rFonts w:ascii="Times New Roman" w:hAnsi="Times New Roman"/>
+        </w:rPr>
+        <w:t>text-align.</w:t>
+      </w:r>
+    </w:p>
+    <w:p>
+      <w:pPr>
+        <w:rPr>
+          <w:rFonts w:ascii="Times New Roman" w:hAnsi="Times New Roman"/>
+        </w:rPr>
+      </w:pPr>
+      <w:r>
+        <w:rPr>
+          <w:rFonts w:ascii="Times New Roman" w:hAnsi="Times New Roman"/>
+        </w:rPr>
+        <w:t>Also style from CSS can be used for more then just a header, can be also use for bigger chunks like &lt;body&gt;&lt;/body&gt; and this will change the style for all the think inside the body.</w:t>
+      </w:r>
+    </w:p>
+    <w:p>
+      <w:pPr>
+        <w:rPr>
+          <w:rFonts w:ascii="Times New Roman" w:hAnsi="Times New Roman"/>
+        </w:rPr>
+      </w:pPr>
+      <w:r>
+        <w:rPr>
+          <w:rFonts w:ascii="Times New Roman" w:hAnsi="Times New Roman"/>
+        </w:rPr>
+        <w:t>Multi-line styling:</w:t>
+      </w:r>
+    </w:p>
+    <w:p>
+      <w:pPr>
+        <w:rPr>
+          <w:rFonts w:ascii="Times New Roman" w:hAnsi="Times New Roman"/>
+        </w:rPr>
+      </w:pPr>
+      <w:r>
+        <w:rPr>
+          <w:rFonts w:ascii="Times New Roman" w:hAnsi="Times New Roman"/>
+        </w:rPr>
+        <w:t>&lt;style&gt;</w:t>
+      </w:r>
+    </w:p>
+    <w:p>
+      <w:pPr>
+        <w:rPr>
+          <w:rFonts w:ascii="Times New Roman" w:hAnsi="Times New Roman"/>
+        </w:rPr>
+      </w:pPr>
+      <w:r>
+        <w:rPr>
+          <w:rFonts w:ascii="Times New Roman" w:hAnsi="Times New Roman"/>
+        </w:rPr>
+        <w:tab/>
+        <w:t>h1{</w:t>
+      </w:r>
+    </w:p>
+    <w:p>
+      <w:pPr>
+        <w:rPr>
+          <w:rFonts w:ascii="Times New Roman" w:hAnsi="Times New Roman"/>
+        </w:rPr>
+      </w:pPr>
+      <w:r>
+        <w:rPr>
+          <w:rFonts w:ascii="Times New Roman" w:hAnsi="Times New Roman"/>
+        </w:rPr>
+        <w:tab/>
+        <w:t xml:space="preserve">       color: blue;</w:t>
+      </w:r>
+    </w:p>
+    <w:p>
+      <w:pPr>
+        <w:rPr>
+          <w:rFonts w:ascii="Times New Roman" w:hAnsi="Times New Roman"/>
+        </w:rPr>
+      </w:pPr>
+      <w:r>
+        <w:rPr>
+          <w:rFonts w:ascii="Times New Roman" w:hAnsi="Times New Roman"/>
+        </w:rPr>
+        <w:tab/>
+        <w:t xml:space="preserve">       text-align: center;</w:t>
+      </w:r>
+    </w:p>
+    <w:p>
+      <w:pPr>
+        <w:rPr>
+          <w:rFonts w:ascii="Times New Roman" w:hAnsi="Times New Roman"/>
+        </w:rPr>
+      </w:pPr>
+      <w:r>
+        <w:rPr>
+          <w:rFonts w:ascii="Times New Roman" w:hAnsi="Times New Roman"/>
+        </w:rPr>
+        <w:tab/>
+        <w:t>}</w:t>
+      </w:r>
+    </w:p>
+    <w:p>
+      <w:pPr>
+        <w:rPr>
+          <w:rFonts w:ascii="Times New Roman" w:hAnsi="Times New Roman"/>
+        </w:rPr>
+      </w:pPr>
+      <w:r>
+        <w:rPr>
+          <w:rFonts w:ascii="Times New Roman" w:hAnsi="Times New Roman"/>
+        </w:rPr>
+        <w:t>&lt;/style&gt;</w:t>
+      </w:r>
+    </w:p>
+    <w:p>
+      <w:pPr>
+        <w:rPr>
+          <w:rFonts w:ascii="Times New Roman" w:hAnsi="Times New Roman"/>
+        </w:rPr>
+      </w:pPr>
+      <w:r>
+        <w:rPr>
+          <w:rFonts w:ascii="Times New Roman" w:hAnsi="Times New Roman"/>
+        </w:rPr>
+        <w:t>This will apply to all H1 elements and also, we can write it and change it only once, clean code and more oriented.</w:t>
+      </w:r>
+    </w:p>
+    <w:p>
+      <w:pPr>
+        <w:rPr>
+          <w:rFonts w:ascii="Times New Roman" w:hAnsi="Times New Roman"/>
+        </w:rPr>
+      </w:pPr>
+      <w:r>
+        <w:rPr>
+          <w:rFonts w:ascii="Times New Roman" w:hAnsi="Times New Roman"/>
+        </w:rPr>
+        <w:t xml:space="preserve">CSS can be </w:t>
+      </w:r>
+      <w:r>
+        <w:rPr>
+          <w:rFonts w:ascii="Times New Roman" w:hAnsi="Times New Roman"/>
+        </w:rPr>
+        <w:t>written</w:t>
+      </w:r>
+      <w:r>
+        <w:rPr>
+          <w:rFonts w:ascii="Times New Roman" w:hAnsi="Times New Roman"/>
+        </w:rPr>
+        <w:t xml:space="preserve"> in the .html file but is more likely and recommended to do it in a .css stand alone file </w:t>
+      </w:r>
+      <w:r>
+        <w:rPr>
+          <w:rFonts w:ascii="Times New Roman" w:hAnsi="Times New Roman"/>
+        </w:rPr>
+        <w:t>and be linked to the .html file.</w:t>
+      </w:r>
+    </w:p>
+    <w:p>
+      <w:pPr>
+        <w:rPr>
+          <w:rFonts w:ascii="Times New Roman" w:hAnsi="Times New Roman"/>
+        </w:rPr>
+      </w:pPr>
+    </w:p>
+    <w:p>
+      <w:pPr>
+        <w:rPr>
+          <w:rFonts w:ascii="Times New Roman" w:hAnsi="Times New Roman"/>
+        </w:rPr>
+      </w:pPr>
+    </w:p>
+    <w:p>
+      <w:pPr>
+        <w:rPr>
+          <w:rFonts w:ascii="Times New Roman" w:hAnsi="Times New Roman"/>
+        </w:rPr>
+      </w:pPr>
+    </w:p>
+    <w:p>
+      <w:pPr>
+        <w:rPr>
+          <w:rFonts w:ascii="Times New Roman" w:hAnsi="Times New Roman"/>
+        </w:rPr>
+      </w:pPr>
+    </w:p>
+    <w:p>
+      <w:pPr>
+        <w:rPr>
+          <w:rFonts w:ascii="Times New Roman" w:hAnsi="Times New Roman"/>
+        </w:rPr>
+      </w:pPr>
+    </w:p>
+    <w:p>
+      <w:pPr>
+        <w:rPr>
+          <w:rFonts w:ascii="Times New Roman" w:hAnsi="Times New Roman"/>
+        </w:rPr>
+      </w:pPr>
+      <w:r>
+        <w:rPr>
+          <w:rFonts w:ascii="Times New Roman" w:hAnsi="Times New Roman"/>
+        </w:rPr>
+        <w:lastRenderedPageBreak/>
+        <w:t xml:space="preserve">Example: </w:t>
+      </w:r>
+    </w:p>
+    <w:p>
+      <w:pPr>
+        <w:rPr>
+          <w:rFonts w:ascii="Times New Roman" w:hAnsi="Times New Roman"/>
+        </w:rPr>
+      </w:pPr>
+      <w:r>
+        <w:rPr>
+          <w:rFonts w:ascii="Times New Roman" w:hAnsi="Times New Roman"/>
+        </w:rPr>
+        <w:tab/>
+        <w:t>&lt;link rel= ”stylesheet” href = ”styles.css”&gt;</w:t>
+      </w:r>
+    </w:p>
+    <w:p>
+      <w:pPr>
+        <w:rPr>
+          <w:rFonts w:ascii="Times New Roman" w:hAnsi="Times New Roman"/>
+        </w:rPr>
+      </w:pPr>
+      <w:r>
+        <w:rPr>
+          <w:rFonts w:ascii="Times New Roman" w:hAnsi="Times New Roman"/>
+        </w:rPr>
+        <w:t xml:space="preserve">Other CSS styles examples: </w:t>
+      </w:r>
+    </w:p>
+    <w:p>
+      <w:pPr>
+        <w:rPr>
+          <w:rFonts w:ascii="Times New Roman" w:hAnsi="Times New Roman"/>
+        </w:rPr>
+      </w:pPr>
+      <w:r>
+        <w:rPr>
+          <w:rFonts w:ascii="Times New Roman" w:hAnsi="Times New Roman"/>
+        </w:rPr>
+        <w:t>&lt;style&gt;</w:t>
+      </w:r>
+    </w:p>
+    <w:p>
+      <w:pPr>
+        <w:rPr>
+          <w:rFonts w:ascii="Times New Roman" w:hAnsi="Times New Roman"/>
+        </w:rPr>
+      </w:pPr>
+      <w:r>
+        <w:rPr>
+          <w:rFonts w:ascii="Times New Roman" w:hAnsi="Times New Roman"/>
+        </w:rPr>
+        <w:tab/>
+        <w:t>div{</w:t>
+      </w:r>
+    </w:p>
+    <w:p>
+      <w:pPr>
+        <w:rPr>
+          <w:rFonts w:ascii="Times New Roman" w:hAnsi="Times New Roman"/>
+        </w:rPr>
+      </w:pPr>
+      <w:r>
+        <w:rPr>
+          <w:rFonts w:ascii="Times New Roman" w:hAnsi="Times New Roman"/>
+        </w:rPr>
+        <w:tab/>
+        <w:t xml:space="preserve">      border: 3px solid black;</w:t>
+      </w:r>
+    </w:p>
+    <w:p>
+      <w:pPr>
+        <w:rPr>
+          <w:rFonts w:ascii="Times New Roman" w:hAnsi="Times New Roman"/>
+        </w:rPr>
+      </w:pPr>
+      <w:r>
+        <w:rPr>
+          <w:rFonts w:ascii="Times New Roman" w:hAnsi="Times New Roman"/>
+        </w:rPr>
+        <w:tab/>
+        <w:t xml:space="preserve">      font-family: Arial, sans</w:t>
+      </w:r>
+      <w:r>
+        <w:rPr>
+          <w:rFonts w:ascii="Times New Roman" w:hAnsi="Times New Roman"/>
+        </w:rPr>
+        <w:t>-serif; -</w:t>
+      </w:r>
+    </w:p>
+    <w:p>
+      <w:pPr>
+        <w:rPr>
+          <w:rFonts w:ascii="Times New Roman" w:hAnsi="Times New Roman"/>
+        </w:rPr>
+      </w:pPr>
+      <w:r>
+        <w:rPr>
+          <w:rFonts w:ascii="Times New Roman" w:hAnsi="Times New Roman"/>
+        </w:rPr>
+        <w:tab/>
+        <w:t xml:space="preserve">      font-size: 28px;</w:t>
+      </w:r>
+    </w:p>
+    <w:p>
+      <w:pPr>
+        <w:rPr>
+          <w:rFonts w:ascii="Times New Roman" w:hAnsi="Times New Roman"/>
+        </w:rPr>
+      </w:pPr>
+      <w:r>
+        <w:rPr>
+          <w:rFonts w:ascii="Times New Roman" w:hAnsi="Times New Roman"/>
+        </w:rPr>
+        <w:tab/>
+        <w:t xml:space="preserve">      font-weight: bold;</w:t>
+      </w:r>
+    </w:p>
+    <w:p>
+      <w:pPr>
+        <w:rPr>
+          <w:rFonts w:ascii="Times New Roman" w:hAnsi="Times New Roman"/>
+        </w:rPr>
+      </w:pPr>
+      <w:r>
+        <w:rPr>
+          <w:rFonts w:ascii="Times New Roman" w:hAnsi="Times New Roman"/>
+        </w:rPr>
+        <w:tab/>
+        <w:t>}</w:t>
+      </w:r>
+    </w:p>
+    <w:p>
+      <w:pPr>
+        <w:rPr>
+          <w:rFonts w:ascii="Times New Roman" w:hAnsi="Times New Roman"/>
+        </w:rPr>
+      </w:pPr>
+      <w:r>
+        <w:rPr>
+          <w:rFonts w:ascii="Times New Roman" w:hAnsi="Times New Roman"/>
+        </w:rPr>
+        <w:t>&lt;/style&gt;</w:t>
+      </w:r>
+    </w:p>
+    <w:p>
+      <w:pPr>
+        <w:rPr>
+          <w:rFonts w:ascii="Times New Roman" w:hAnsi="Times New Roman"/>
+        </w:rPr>
+      </w:pPr>
+      <w:r>
+        <w:rPr>
+          <w:rFonts w:ascii="Times New Roman" w:hAnsi="Times New Roman"/>
+        </w:rPr>
+        <w:t>Multiple date selector for CSS:</w:t>
+      </w:r>
+    </w:p>
+    <w:p>
+      <w:pPr>
+        <w:rPr>
+          <w:rFonts w:ascii="Times New Roman" w:hAnsi="Times New Roman"/>
+        </w:rPr>
+      </w:pPr>
+      <w:r>
+        <w:rPr>
+          <w:rFonts w:ascii="Times New Roman" w:hAnsi="Times New Roman"/>
+        </w:rPr>
+        <w:t>If for example you would like to have h1, h2 and h3 with the same CSS style you can write them like this:</w:t>
+      </w:r>
+    </w:p>
+    <w:p>
+      <w:pPr>
+        <w:rPr>
+          <w:rFonts w:ascii="Times New Roman" w:hAnsi="Times New Roman"/>
+        </w:rPr>
+      </w:pPr>
+      <w:r>
+        <w:rPr>
+          <w:rFonts w:ascii="Times New Roman" w:hAnsi="Times New Roman"/>
+        </w:rPr>
+        <w:t>&lt;style&gt;</w:t>
+      </w:r>
+    </w:p>
+    <w:p>
+      <w:pPr>
+        <w:ind w:firstLine="720"/>
+        <w:rPr>
+          <w:rFonts w:ascii="Times New Roman" w:hAnsi="Times New Roman"/>
+        </w:rPr>
+      </w:pPr>
+      <w:r>
+        <w:rPr>
+          <w:rFonts w:ascii="Times New Roman" w:hAnsi="Times New Roman"/>
+        </w:rPr>
+        <w:t>h1, h2, h3{</w:t>
+      </w:r>
+    </w:p>
+    <w:p>
+      <w:pPr>
+        <w:ind w:firstLine="720"/>
+        <w:rPr>
+          <w:rFonts w:ascii="Times New Roman" w:hAnsi="Times New Roman"/>
+        </w:rPr>
+      </w:pPr>
+      <w:r>
+        <w:rPr>
+          <w:rFonts w:ascii="Times New Roman" w:hAnsi="Times New Roman"/>
+        </w:rPr>
+        <w:t>}</w:t>
+      </w:r>
+    </w:p>
+    <w:p>
+      <w:pPr>
+        <w:rPr>
+          <w:rFonts w:ascii="Times New Roman" w:hAnsi="Times New Roman"/>
+        </w:rPr>
+      </w:pPr>
+      <w:r>
+        <w:rPr>
+          <w:rFonts w:ascii="Times New Roman" w:hAnsi="Times New Roman"/>
+        </w:rPr>
+        <w:t>&lt;/style&gt;</w:t>
+      </w:r>
+    </w:p>
+    <w:p>
+      <w:pPr>
+        <w:rPr>
+          <w:rFonts w:ascii="Times New Roman" w:hAnsi="Times New Roman"/>
+        </w:rPr>
+      </w:pPr>
+      <w:r>
+        <w:rPr>
+          <w:rFonts w:ascii="Times New Roman" w:hAnsi="Times New Roman"/>
+        </w:rPr>
+        <w:t>CSS Specificity:</w:t>
+      </w:r>
+    </w:p>
+    <w:p>
+      <w:pPr>
+        <w:pStyle w:val="ListParagraph"/>
+        <w:numPr>
+          <w:ilvl w:val="0"/>
+          <w:numId w:val="4"/>
+        </w:numPr>
+        <w:rPr>
+          <w:rFonts w:ascii="Times New Roman" w:hAnsi="Times New Roman"/>
+        </w:rPr>
+      </w:pPr>
+      <w:r>
+        <w:rPr>
+          <w:rFonts w:ascii="Times New Roman" w:hAnsi="Times New Roman"/>
+        </w:rPr>
+        <w:t>Inline – apply it to the inline element if is written inline we are applying it directly to it.</w:t>
+      </w:r>
+    </w:p>
+    <w:p>
+      <w:pPr>
+        <w:pStyle w:val="ListParagraph"/>
+        <w:numPr>
+          <w:ilvl w:val="0"/>
+          <w:numId w:val="4"/>
+        </w:numPr>
+        <w:rPr>
+          <w:rFonts w:ascii="Times New Roman" w:hAnsi="Times New Roman"/>
+        </w:rPr>
+      </w:pPr>
+      <w:r>
+        <w:rPr>
+          <w:rFonts w:ascii="Times New Roman" w:hAnsi="Times New Roman"/>
+        </w:rPr>
+        <w:t xml:space="preserve">Id – Id is the next most important </w:t>
+      </w:r>
+    </w:p>
+    <w:p>
+      <w:pPr>
+        <w:pStyle w:val="ListParagraph"/>
+        <w:numPr>
+          <w:ilvl w:val="0"/>
+          <w:numId w:val="4"/>
+        </w:numPr>
+        <w:rPr>
+          <w:rFonts w:ascii="Times New Roman" w:hAnsi="Times New Roman"/>
+        </w:rPr>
+      </w:pPr>
+      <w:r>
+        <w:rPr>
+          <w:rFonts w:ascii="Times New Roman" w:hAnsi="Times New Roman"/>
+        </w:rPr>
+        <w:t xml:space="preserve">Class – Class is the next in line after this two </w:t>
+      </w:r>
+    </w:p>
+    <w:p>
+      <w:pPr>
+        <w:pStyle w:val="ListParagraph"/>
+        <w:numPr>
+          <w:ilvl w:val="0"/>
+          <w:numId w:val="4"/>
+        </w:numPr>
+        <w:rPr>
+          <w:rFonts w:ascii="Times New Roman" w:hAnsi="Times New Roman"/>
+        </w:rPr>
+      </w:pPr>
+      <w:r>
+        <w:rPr>
+          <w:rFonts w:ascii="Times New Roman" w:hAnsi="Times New Roman"/>
+        </w:rPr>
+        <w:t>Type – and type is the less specific</w:t>
+      </w:r>
+    </w:p>
+    <w:p>
+      <w:pPr>
+        <w:rPr>
+          <w:rFonts w:ascii="Times New Roman" w:hAnsi="Times New Roman"/>
+        </w:rPr>
+      </w:pPr>
+      <w:r>
+        <w:rPr>
+          <w:rFonts w:ascii="Times New Roman" w:hAnsi="Times New Roman"/>
+        </w:rPr>
+        <w:t>CSS Selectors:</w:t>
+      </w:r>
+      <w:r>
+        <w:rPr>
+          <w:rFonts w:ascii="Times New Roman" w:hAnsi="Times New Roman"/>
+        </w:rPr>
+        <w:t xml:space="preserve"> 1:17:30</w:t>
+      </w:r>
+    </w:p>
+    <w:p>
+      <w:pPr>
+        <w:pStyle w:val="ListParagraph"/>
+        <w:numPr>
+          <w:ilvl w:val="0"/>
+          <w:numId w:val="6"/>
+        </w:numPr>
+        <w:rPr>
+          <w:rFonts w:ascii="Times New Roman" w:hAnsi="Times New Roman"/>
+        </w:rPr>
+      </w:pPr>
+    </w:p>
+    <w:p>
+      <w:pPr>
+        <w:rPr>
+          <w:rFonts w:ascii="Times New Roman" w:hAnsi="Times New Roman"/>
+        </w:rPr>
+      </w:pPr>
     </w:p>
     <w:sectPr>
+      <w:footerReference w:type="even" r:id="rId10"/>
+      <w:footerReference w:type="default" r:id="rId11"/>
+      <w:footerReference w:type="first" r:id="rId12"/>
       <w:pgSz w:w="12240" w:h="15840"/>
       <w:pgMar w:top="1440" w:right="1440" w:bottom="1440" w:left="1440" w:header="720" w:footer="720" w:gutter="0"/>
       <w:cols w:space="720"/>
@@ -1981,9 +2456,541 @@
 </w:document>
 </file>
 
+<file path=word/endnotes.xml><?xml version="1.0" encoding="utf-8"?>
+<w:endnotes xmlns:wpc="http://schemas.microsoft.com/office/word/2010/wordprocessingCanvas" xmlns:cx="http://schemas.microsoft.com/office/drawing/2014/chartex" xmlns:cx1="http://schemas.microsoft.com/office/drawing/2015/9/8/chartex" xmlns:cx2="http://schemas.microsoft.com/office/drawing/2015/10/21/chartex" xmlns:cx3="http://schemas.microsoft.com/office/drawing/2016/5/9/chartex" xmlns:cx4="http://schemas.microsoft.com/office/drawing/2016/5/10/chartex" xmlns:cx5="http://schemas.microsoft.com/office/drawing/2016/5/11/chartex" xmlns:cx6="http://schemas.microsoft.com/office/drawing/2016/5/12/chartex" xmlns:cx7="http://schemas.microsoft.com/office/drawing/2016/5/13/chartex" xmlns:cx8="http://schemas.microsoft.com/office/drawing/2016/5/14/chartex" xmlns:mc="http://schemas.openxmlformats.org/markup-compatibility/2006" xmlns:aink="http://schemas.microsoft.com/office/drawing/2016/ink" xmlns:am3d="http://schemas.microsoft.com/office/drawing/2017/model3d" xmlns:o="urn:schemas-microsoft-com:office:office" xmlns:oel="http://schemas.microsoft.com/office/2019/extlst" xmlns:r="http://schemas.openxmlformats.org/officeDocument/2006/relationships" xmlns:m="http://schemas.openxmlformats.org/officeDocument/2006/math" xmlns:v="urn:schemas-microsoft-com:vml" xmlns:wp14="http://schemas.microsoft.com/office/word/2010/wordprocessingDrawing" xmlns:wp="http://schemas.openxmlformats.org/drawingml/2006/wordprocessingDrawing" xmlns:w10="urn:schemas-microsoft-com:office:word" xmlns:w="http://schemas.openxmlformats.org/wordprocessingml/2006/main" xmlns:w14="http://schemas.microsoft.com/office/word/2010/wordml" xmlns:w15="http://schemas.microsoft.com/office/word/2012/wordml" xmlns:w16cex="http://schemas.microsoft.com/office/word/2018/wordml/cex" xmlns:w16cid="http://schemas.microsoft.com/office/word/2016/wordml/cid" xmlns:w16="http://schemas.microsoft.com/office/word/2018/wordml" xmlns:w16sdtdh="http://schemas.microsoft.com/office/word/2020/wordml/sdtdatahash" xmlns:w16se="http://schemas.microsoft.com/office/word/2015/wordml/symex" xmlns:wpg="http://schemas.microsoft.com/office/word/2010/wordprocessingGroup" xmlns:wpi="http://schemas.microsoft.com/office/word/2010/wordprocessingInk" xmlns:wne="http://schemas.microsoft.com/office/word/2006/wordml" xmlns:wps="http://schemas.microsoft.com/office/word/2010/wordprocessingShape" mc:Ignorable="w14 w15 w16se w16cid w16 w16cex w16sdtdh wp14">
+  <w:endnote w:type="separator" w:id="-1">
+    <w:p>
+      <w:pPr>
+        <w:spacing w:after="0" w:line="240" w:lineRule="auto"/>
+      </w:pPr>
+      <w:r>
+        <w:separator/>
+      </w:r>
+    </w:p>
+  </w:endnote>
+  <w:endnote w:type="continuationSeparator" w:id="0">
+    <w:p>
+      <w:pPr>
+        <w:spacing w:after="0" w:line="240" w:lineRule="auto"/>
+      </w:pPr>
+      <w:r>
+        <w:continuationSeparator/>
+      </w:r>
+    </w:p>
+  </w:endnote>
+</w:endnotes>
+</file>
+
+<file path=word/footer1.xml><?xml version="1.0" encoding="utf-8"?>
+<w:ftr xmlns:wpc="http://schemas.microsoft.com/office/word/2010/wordprocessingCanvas" xmlns:cx="http://schemas.microsoft.com/office/drawing/2014/chartex" xmlns:cx1="http://schemas.microsoft.com/office/drawing/2015/9/8/chartex" xmlns:cx2="http://schemas.microsoft.com/office/drawing/2015/10/21/chartex" xmlns:cx3="http://schemas.microsoft.com/office/drawing/2016/5/9/chartex" xmlns:cx4="http://schemas.microsoft.com/office/drawing/2016/5/10/chartex" xmlns:cx5="http://schemas.microsoft.com/office/drawing/2016/5/11/chartex" xmlns:cx6="http://schemas.microsoft.com/office/drawing/2016/5/12/chartex" xmlns:cx7="http://schemas.microsoft.com/office/drawing/2016/5/13/chartex" xmlns:cx8="http://schemas.microsoft.com/office/drawing/2016/5/14/chartex" xmlns:mc="http://schemas.openxmlformats.org/markup-compatibility/2006" xmlns:aink="http://schemas.microsoft.com/office/drawing/2016/ink" xmlns:am3d="http://schemas.microsoft.com/office/drawing/2017/model3d" xmlns:o="urn:schemas-microsoft-com:office:office" xmlns:oel="http://schemas.microsoft.com/office/2019/extlst" xmlns:r="http://schemas.openxmlformats.org/officeDocument/2006/relationships" xmlns:m="http://schemas.openxmlformats.org/officeDocument/2006/math" xmlns:v="urn:schemas-microsoft-com:vml" xmlns:wp14="http://schemas.microsoft.com/office/word/2010/wordprocessingDrawing" xmlns:wp="http://schemas.openxmlformats.org/drawingml/2006/wordprocessingDrawing" xmlns:w10="urn:schemas-microsoft-com:office:word" xmlns:w="http://schemas.openxmlformats.org/wordprocessingml/2006/main" xmlns:w14="http://schemas.microsoft.com/office/word/2010/wordml" xmlns:w15="http://schemas.microsoft.com/office/word/2012/wordml" xmlns:w16cex="http://schemas.microsoft.com/office/word/2018/wordml/cex" xmlns:w16cid="http://schemas.microsoft.com/office/word/2016/wordml/cid" xmlns:w16="http://schemas.microsoft.com/office/word/2018/wordml" xmlns:w16sdtdh="http://schemas.microsoft.com/office/word/2020/wordml/sdtdatahash" xmlns:w16se="http://schemas.microsoft.com/office/word/2015/wordml/symex" xmlns:wpg="http://schemas.microsoft.com/office/word/2010/wordprocessingGroup" xmlns:wpi="http://schemas.microsoft.com/office/word/2010/wordprocessingInk" xmlns:wne="http://schemas.microsoft.com/office/word/2006/wordml" xmlns:wps="http://schemas.microsoft.com/office/word/2010/wordprocessingShape" mc:Ignorable="w14 w15 w16se w16cid w16 w16cex w16sdtdh wp14">
+  <w:p>
+    <w:pPr>
+      <w:pStyle w:val="Footer"/>
+    </w:pPr>
+    <w:r>
+      <w:rPr>
+        <w:noProof/>
+      </w:rPr>
+      <mc:AlternateContent>
+        <mc:Choice Requires="wps">
+          <w:drawing>
+            <wp:anchor distT="0" distB="0" distL="0" distR="0" simplePos="0" relativeHeight="251659264" behindDoc="0" locked="0" layoutInCell="1" allowOverlap="1" wp14:anchorId="456A5515" wp14:editId="4B042790">
+              <wp:simplePos x="635" y="635"/>
+              <wp:positionH relativeFrom="page">
+                <wp:align>center</wp:align>
+              </wp:positionH>
+              <wp:positionV relativeFrom="page">
+                <wp:align>bottom</wp:align>
+              </wp:positionV>
+              <wp:extent cx="322580" cy="334010"/>
+              <wp:effectExtent l="0" t="0" r="1270" b="0"/>
+              <wp:wrapNone/>
+              <wp:docPr id="521562807" name="Text Box 2" descr="Internal">
+                <a:extLst xmlns:a="http://schemas.openxmlformats.org/drawingml/2006/main">
+                  <a:ext uri="{5AE41FA2-C0FF-4470-9BD4-5FADCA87CBE2}">
+                    <aclsh:classification xmlns:aclsh="http://schemas.microsoft.com/office/drawing/2020/classificationShape" classificationOutcomeType="ftr"/>
+                  </a:ext>
+                </a:extLst>
+              </wp:docPr>
+              <wp:cNvGraphicFramePr/>
+              <a:graphic xmlns:a="http://schemas.openxmlformats.org/drawingml/2006/main">
+                <a:graphicData uri="http://schemas.microsoft.com/office/word/2010/wordprocessingShape">
+                  <wps:wsp>
+                    <wps:cNvSpPr txBox="1"/>
+                    <wps:spPr>
+                      <a:xfrm>
+                        <a:off x="0" y="0"/>
+                        <a:ext cx="322580" cy="334010"/>
+                      </a:xfrm>
+                      <a:prstGeom prst="rect">
+                        <a:avLst/>
+                      </a:prstGeom>
+                      <a:noFill/>
+                      <a:ln>
+                        <a:noFill/>
+                      </a:ln>
+                    </wps:spPr>
+                    <wps:txbx>
+                      <w:txbxContent>
+                        <w:p>
+                          <w:pPr>
+                            <w:spacing w:after="0"/>
+                            <w:rPr>
+                              <w:rFonts w:ascii="Calibri" w:eastAsia="Calibri" w:hAnsi="Calibri" w:cs="Calibri"/>
+                              <w:noProof/>
+                              <w:color w:val="000000"/>
+                              <w:sz w:val="16"/>
+                              <w:szCs w:val="16"/>
+                            </w:rPr>
+                          </w:pPr>
+                          <w:r>
+                            <w:rPr>
+                              <w:rFonts w:ascii="Calibri" w:eastAsia="Calibri" w:hAnsi="Calibri" w:cs="Calibri"/>
+                              <w:noProof/>
+                              <w:color w:val="000000"/>
+                              <w:sz w:val="16"/>
+                              <w:szCs w:val="16"/>
+                            </w:rPr>
+                            <w:t>Internal</w:t>
+                          </w:r>
+                        </w:p>
+                      </w:txbxContent>
+                    </wps:txbx>
+                    <wps:bodyPr rot="0" spcFirstLastPara="0" vertOverflow="overflow" horzOverflow="overflow" vert="horz" wrap="none" lIns="0" tIns="0" rIns="0" bIns="190500" numCol="1" spcCol="0" rtlCol="0" fromWordArt="0" anchor="b" anchorCtr="0" forceAA="0" compatLnSpc="1">
+                      <a:prstTxWarp prst="textNoShape">
+                        <a:avLst/>
+                      </a:prstTxWarp>
+                      <a:spAutoFit/>
+                    </wps:bodyPr>
+                  </wps:wsp>
+                </a:graphicData>
+              </a:graphic>
+            </wp:anchor>
+          </w:drawing>
+        </mc:Choice>
+        <mc:Fallback>
+          <w:pict>
+            <v:shapetype w14:anchorId="456A5515" id="_x0000_t202" coordsize="21600,21600" o:spt="202" path="m,l,21600r21600,l21600,xe">
+              <v:stroke joinstyle="miter"/>
+              <v:path gradientshapeok="t" o:connecttype="rect"/>
+            </v:shapetype>
+            <v:shape id="Text Box 2" o:spid="_x0000_s1026" type="#_x0000_t202" alt="Internal" style="position:absolute;margin-left:0;margin-top:0;width:25.4pt;height:26.3pt;z-index:251659264;visibility:visible;mso-wrap-style:none;mso-wrap-distance-left:0;mso-wrap-distance-top:0;mso-wrap-distance-right:0;mso-wrap-distance-bottom:0;mso-position-horizontal:center;mso-position-horizontal-relative:page;mso-position-vertical:bottom;mso-position-vertical-relative:page;v-text-anchor:bottom" o:gfxdata="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" filled="f" stroked="f">
+              <v:fill o:detectmouseclick="t"/>
+              <v:textbox style="mso-fit-shape-to-text:t" inset="0,0,0,15pt">
+                <w:txbxContent>
+                  <w:p>
+                    <w:pPr>
+                      <w:spacing w:after="0"/>
+                      <w:rPr>
+                        <w:rFonts w:ascii="Calibri" w:eastAsia="Calibri" w:hAnsi="Calibri" w:cs="Calibri"/>
+                        <w:noProof/>
+                        <w:color w:val="000000"/>
+                        <w:sz w:val="16"/>
+                        <w:szCs w:val="16"/>
+                      </w:rPr>
+                    </w:pPr>
+                    <w:r>
+                      <w:rPr>
+                        <w:rFonts w:ascii="Calibri" w:eastAsia="Calibri" w:hAnsi="Calibri" w:cs="Calibri"/>
+                        <w:noProof/>
+                        <w:color w:val="000000"/>
+                        <w:sz w:val="16"/>
+                        <w:szCs w:val="16"/>
+                      </w:rPr>
+                      <w:t>Internal</w:t>
+                    </w:r>
+                  </w:p>
+                </w:txbxContent>
+              </v:textbox>
+              <w10:wrap anchorx="page" anchory="page"/>
+            </v:shape>
+          </w:pict>
+        </mc:Fallback>
+      </mc:AlternateContent>
+    </w:r>
+  </w:p>
+</w:ftr>
+</file>
+
+<file path=word/footer2.xml><?xml version="1.0" encoding="utf-8"?>
+<w:ftr xmlns:wpc="http://schemas.microsoft.com/office/word/2010/wordprocessingCanvas" xmlns:cx="http://schemas.microsoft.com/office/drawing/2014/chartex" xmlns:cx1="http://schemas.microsoft.com/office/drawing/2015/9/8/chartex" xmlns:cx2="http://schemas.microsoft.com/office/drawing/2015/10/21/chartex" xmlns:cx3="http://schemas.microsoft.com/office/drawing/2016/5/9/chartex" xmlns:cx4="http://schemas.microsoft.com/office/drawing/2016/5/10/chartex" xmlns:cx5="http://schemas.microsoft.com/office/drawing/2016/5/11/chartex" xmlns:cx6="http://schemas.microsoft.com/office/drawing/2016/5/12/chartex" xmlns:cx7="http://schemas.microsoft.com/office/drawing/2016/5/13/chartex" xmlns:cx8="http://schemas.microsoft.com/office/drawing/2016/5/14/chartex" xmlns:mc="http://schemas.openxmlformats.org/markup-compatibility/2006" xmlns:aink="http://schemas.microsoft.com/office/drawing/2016/ink" xmlns:am3d="http://schemas.microsoft.com/office/drawing/2017/model3d" xmlns:o="urn:schemas-microsoft-com:office:office" xmlns:oel="http://schemas.microsoft.com/office/2019/extlst" xmlns:r="http://schemas.openxmlformats.org/officeDocument/2006/relationships" xmlns:m="http://schemas.openxmlformats.org/officeDocument/2006/math" xmlns:v="urn:schemas-microsoft-com:vml" xmlns:wp14="http://schemas.microsoft.com/office/word/2010/wordprocessingDrawing" xmlns:wp="http://schemas.openxmlformats.org/drawingml/2006/wordprocessingDrawing" xmlns:w10="urn:schemas-microsoft-com:office:word" xmlns:w="http://schemas.openxmlformats.org/wordprocessingml/2006/main" xmlns:w14="http://schemas.microsoft.com/office/word/2010/wordml" xmlns:w15="http://schemas.microsoft.com/office/word/2012/wordml" xmlns:w16cex="http://schemas.microsoft.com/office/word/2018/wordml/cex" xmlns:w16cid="http://schemas.microsoft.com/office/word/2016/wordml/cid" xmlns:w16="http://schemas.microsoft.com/office/word/2018/wordml" xmlns:w16sdtdh="http://schemas.microsoft.com/office/word/2020/wordml/sdtdatahash" xmlns:w16se="http://schemas.microsoft.com/office/word/2015/wordml/symex" xmlns:wpg="http://schemas.microsoft.com/office/word/2010/wordprocessingGroup" xmlns:wpi="http://schemas.microsoft.com/office/word/2010/wordprocessingInk" xmlns:wne="http://schemas.microsoft.com/office/word/2006/wordml" xmlns:wps="http://schemas.microsoft.com/office/word/2010/wordprocessingShape" mc:Ignorable="w14 w15 w16se w16cid w16 w16cex w16sdtdh wp14">
+  <w:p>
+    <w:pPr>
+      <w:pStyle w:val="Footer"/>
+    </w:pPr>
+    <w:r>
+      <w:rPr>
+        <w:noProof/>
+      </w:rPr>
+      <mc:AlternateContent>
+        <mc:Choice Requires="wps">
+          <w:drawing>
+            <wp:anchor distT="0" distB="0" distL="0" distR="0" simplePos="0" relativeHeight="251660288" behindDoc="0" locked="0" layoutInCell="1" allowOverlap="1" wp14:anchorId="4D8C7258" wp14:editId="7D34AD0B">
+              <wp:simplePos x="914400" y="9420225"/>
+              <wp:positionH relativeFrom="page">
+                <wp:align>center</wp:align>
+              </wp:positionH>
+              <wp:positionV relativeFrom="page">
+                <wp:align>bottom</wp:align>
+              </wp:positionV>
+              <wp:extent cx="322580" cy="334010"/>
+              <wp:effectExtent l="0" t="0" r="1270" b="0"/>
+              <wp:wrapNone/>
+              <wp:docPr id="351573485" name="Text Box 3" descr="Internal">
+                <a:extLst xmlns:a="http://schemas.openxmlformats.org/drawingml/2006/main">
+                  <a:ext uri="{5AE41FA2-C0FF-4470-9BD4-5FADCA87CBE2}">
+                    <aclsh:classification xmlns:aclsh="http://schemas.microsoft.com/office/drawing/2020/classificationShape" classificationOutcomeType="ftr"/>
+                  </a:ext>
+                </a:extLst>
+              </wp:docPr>
+              <wp:cNvGraphicFramePr/>
+              <a:graphic xmlns:a="http://schemas.openxmlformats.org/drawingml/2006/main">
+                <a:graphicData uri="http://schemas.microsoft.com/office/word/2010/wordprocessingShape">
+                  <wps:wsp>
+                    <wps:cNvSpPr txBox="1"/>
+                    <wps:spPr>
+                      <a:xfrm>
+                        <a:off x="0" y="0"/>
+                        <a:ext cx="322580" cy="334010"/>
+                      </a:xfrm>
+                      <a:prstGeom prst="rect">
+                        <a:avLst/>
+                      </a:prstGeom>
+                      <a:noFill/>
+                      <a:ln>
+                        <a:noFill/>
+                      </a:ln>
+                    </wps:spPr>
+                    <wps:txbx>
+                      <w:txbxContent>
+                        <w:p>
+                          <w:pPr>
+                            <w:spacing w:after="0"/>
+                            <w:rPr>
+                              <w:rFonts w:ascii="Calibri" w:eastAsia="Calibri" w:hAnsi="Calibri" w:cs="Calibri"/>
+                              <w:noProof/>
+                              <w:color w:val="000000"/>
+                              <w:sz w:val="16"/>
+                              <w:szCs w:val="16"/>
+                            </w:rPr>
+                          </w:pPr>
+                          <w:r>
+                            <w:rPr>
+                              <w:rFonts w:ascii="Calibri" w:eastAsia="Calibri" w:hAnsi="Calibri" w:cs="Calibri"/>
+                              <w:noProof/>
+                              <w:color w:val="000000"/>
+                              <w:sz w:val="16"/>
+                              <w:szCs w:val="16"/>
+                            </w:rPr>
+                            <w:t>Internal</w:t>
+                          </w:r>
+                        </w:p>
+                      </w:txbxContent>
+                    </wps:txbx>
+                    <wps:bodyPr rot="0" spcFirstLastPara="0" vertOverflow="overflow" horzOverflow="overflow" vert="horz" wrap="none" lIns="0" tIns="0" rIns="0" bIns="190500" numCol="1" spcCol="0" rtlCol="0" fromWordArt="0" anchor="b" anchorCtr="0" forceAA="0" compatLnSpc="1">
+                      <a:prstTxWarp prst="textNoShape">
+                        <a:avLst/>
+                      </a:prstTxWarp>
+                      <a:spAutoFit/>
+                    </wps:bodyPr>
+                  </wps:wsp>
+                </a:graphicData>
+              </a:graphic>
+            </wp:anchor>
+          </w:drawing>
+        </mc:Choice>
+        <mc:Fallback>
+          <w:pict>
+            <v:shapetype w14:anchorId="4D8C7258" id="_x0000_t202" coordsize="21600,21600" o:spt="202" path="m,l,21600r21600,l21600,xe">
+              <v:stroke joinstyle="miter"/>
+              <v:path gradientshapeok="t" o:connecttype="rect"/>
+            </v:shapetype>
+            <v:shape id="Text Box 3" o:spid="_x0000_s1027" type="#_x0000_t202" alt="Internal" style="position:absolute;margin-left:0;margin-top:0;width:25.4pt;height:26.3pt;z-index:251660288;visibility:visible;mso-wrap-style:none;mso-wrap-distance-left:0;mso-wrap-distance-top:0;mso-wrap-distance-right:0;mso-wrap-distance-bottom:0;mso-position-horizontal:center;mso-position-horizontal-relative:page;mso-position-vertical:bottom;mso-position-vertical-relative:page;v-text-anchor:bottom" o:gfxdata="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" filled="f" stroked="f">
+              <v:fill o:detectmouseclick="t"/>
+              <v:textbox style="mso-fit-shape-to-text:t" inset="0,0,0,15pt">
+                <w:txbxContent>
+                  <w:p>
+                    <w:pPr>
+                      <w:spacing w:after="0"/>
+                      <w:rPr>
+                        <w:rFonts w:ascii="Calibri" w:eastAsia="Calibri" w:hAnsi="Calibri" w:cs="Calibri"/>
+                        <w:noProof/>
+                        <w:color w:val="000000"/>
+                        <w:sz w:val="16"/>
+                        <w:szCs w:val="16"/>
+                      </w:rPr>
+                    </w:pPr>
+                    <w:r>
+                      <w:rPr>
+                        <w:rFonts w:ascii="Calibri" w:eastAsia="Calibri" w:hAnsi="Calibri" w:cs="Calibri"/>
+                        <w:noProof/>
+                        <w:color w:val="000000"/>
+                        <w:sz w:val="16"/>
+                        <w:szCs w:val="16"/>
+                      </w:rPr>
+                      <w:t>Internal</w:t>
+                    </w:r>
+                  </w:p>
+                </w:txbxContent>
+              </v:textbox>
+              <w10:wrap anchorx="page" anchory="page"/>
+            </v:shape>
+          </w:pict>
+        </mc:Fallback>
+      </mc:AlternateContent>
+    </w:r>
+  </w:p>
+</w:ftr>
+</file>
+
+<file path=word/footer3.xml><?xml version="1.0" encoding="utf-8"?>
+<w:ftr xmlns:wpc="http://schemas.microsoft.com/office/word/2010/wordprocessingCanvas" xmlns:cx="http://schemas.microsoft.com/office/drawing/2014/chartex" xmlns:cx1="http://schemas.microsoft.com/office/drawing/2015/9/8/chartex" xmlns:cx2="http://schemas.microsoft.com/office/drawing/2015/10/21/chartex" xmlns:cx3="http://schemas.microsoft.com/office/drawing/2016/5/9/chartex" xmlns:cx4="http://schemas.microsoft.com/office/drawing/2016/5/10/chartex" xmlns:cx5="http://schemas.microsoft.com/office/drawing/2016/5/11/chartex" xmlns:cx6="http://schemas.microsoft.com/office/drawing/2016/5/12/chartex" xmlns:cx7="http://schemas.microsoft.com/office/drawing/2016/5/13/chartex" xmlns:cx8="http://schemas.microsoft.com/office/drawing/2016/5/14/chartex" xmlns:mc="http://schemas.openxmlformats.org/markup-compatibility/2006" xmlns:aink="http://schemas.microsoft.com/office/drawing/2016/ink" xmlns:am3d="http://schemas.microsoft.com/office/drawing/2017/model3d" xmlns:o="urn:schemas-microsoft-com:office:office" xmlns:oel="http://schemas.microsoft.com/office/2019/extlst" xmlns:r="http://schemas.openxmlformats.org/officeDocument/2006/relationships" xmlns:m="http://schemas.openxmlformats.org/officeDocument/2006/math" xmlns:v="urn:schemas-microsoft-com:vml" xmlns:wp14="http://schemas.microsoft.com/office/word/2010/wordprocessingDrawing" xmlns:wp="http://schemas.openxmlformats.org/drawingml/2006/wordprocessingDrawing" xmlns:w10="urn:schemas-microsoft-com:office:word" xmlns:w="http://schemas.openxmlformats.org/wordprocessingml/2006/main" xmlns:w14="http://schemas.microsoft.com/office/word/2010/wordml" xmlns:w15="http://schemas.microsoft.com/office/word/2012/wordml" xmlns:w16cex="http://schemas.microsoft.com/office/word/2018/wordml/cex" xmlns:w16cid="http://schemas.microsoft.com/office/word/2016/wordml/cid" xmlns:w16="http://schemas.microsoft.com/office/word/2018/wordml" xmlns:w16sdtdh="http://schemas.microsoft.com/office/word/2020/wordml/sdtdatahash" xmlns:w16se="http://schemas.microsoft.com/office/word/2015/wordml/symex" xmlns:wpg="http://schemas.microsoft.com/office/word/2010/wordprocessingGroup" xmlns:wpi="http://schemas.microsoft.com/office/word/2010/wordprocessingInk" xmlns:wne="http://schemas.microsoft.com/office/word/2006/wordml" xmlns:wps="http://schemas.microsoft.com/office/word/2010/wordprocessingShape" mc:Ignorable="w14 w15 w16se w16cid w16 w16cex w16sdtdh wp14">
+  <w:p>
+    <w:pPr>
+      <w:pStyle w:val="Footer"/>
+    </w:pPr>
+    <w:r>
+      <w:rPr>
+        <w:noProof/>
+      </w:rPr>
+      <mc:AlternateContent>
+        <mc:Choice Requires="wps">
+          <w:drawing>
+            <wp:anchor distT="0" distB="0" distL="0" distR="0" simplePos="0" relativeHeight="251658240" behindDoc="0" locked="0" layoutInCell="1" allowOverlap="1" wp14:anchorId="3562D521" wp14:editId="1565F2DE">
+              <wp:simplePos x="635" y="635"/>
+              <wp:positionH relativeFrom="page">
+                <wp:align>center</wp:align>
+              </wp:positionH>
+              <wp:positionV relativeFrom="page">
+                <wp:align>bottom</wp:align>
+              </wp:positionV>
+              <wp:extent cx="322580" cy="334010"/>
+              <wp:effectExtent l="0" t="0" r="1270" b="0"/>
+              <wp:wrapNone/>
+              <wp:docPr id="820263531" name="Text Box 1" descr="Internal">
+                <a:extLst xmlns:a="http://schemas.openxmlformats.org/drawingml/2006/main">
+                  <a:ext uri="{5AE41FA2-C0FF-4470-9BD4-5FADCA87CBE2}">
+                    <aclsh:classification xmlns:aclsh="http://schemas.microsoft.com/office/drawing/2020/classificationShape" classificationOutcomeType="ftr"/>
+                  </a:ext>
+                </a:extLst>
+              </wp:docPr>
+              <wp:cNvGraphicFramePr/>
+              <a:graphic xmlns:a="http://schemas.openxmlformats.org/drawingml/2006/main">
+                <a:graphicData uri="http://schemas.microsoft.com/office/word/2010/wordprocessingShape">
+                  <wps:wsp>
+                    <wps:cNvSpPr txBox="1"/>
+                    <wps:spPr>
+                      <a:xfrm>
+                        <a:off x="0" y="0"/>
+                        <a:ext cx="322580" cy="334010"/>
+                      </a:xfrm>
+                      <a:prstGeom prst="rect">
+                        <a:avLst/>
+                      </a:prstGeom>
+                      <a:noFill/>
+                      <a:ln>
+                        <a:noFill/>
+                      </a:ln>
+                    </wps:spPr>
+                    <wps:txbx>
+                      <w:txbxContent>
+                        <w:p>
+                          <w:pPr>
+                            <w:spacing w:after="0"/>
+                            <w:rPr>
+                              <w:rFonts w:ascii="Calibri" w:eastAsia="Calibri" w:hAnsi="Calibri" w:cs="Calibri"/>
+                              <w:noProof/>
+                              <w:color w:val="000000"/>
+                              <w:sz w:val="16"/>
+                              <w:szCs w:val="16"/>
+                            </w:rPr>
+                          </w:pPr>
+                          <w:r>
+                            <w:rPr>
+                              <w:rFonts w:ascii="Calibri" w:eastAsia="Calibri" w:hAnsi="Calibri" w:cs="Calibri"/>
+                              <w:noProof/>
+                              <w:color w:val="000000"/>
+                              <w:sz w:val="16"/>
+                              <w:szCs w:val="16"/>
+                            </w:rPr>
+                            <w:t>Internal</w:t>
+                          </w:r>
+                        </w:p>
+                      </w:txbxContent>
+                    </wps:txbx>
+                    <wps:bodyPr rot="0" spcFirstLastPara="0" vertOverflow="overflow" horzOverflow="overflow" vert="horz" wrap="none" lIns="0" tIns="0" rIns="0" bIns="190500" numCol="1" spcCol="0" rtlCol="0" fromWordArt="0" anchor="b" anchorCtr="0" forceAA="0" compatLnSpc="1">
+                      <a:prstTxWarp prst="textNoShape">
+                        <a:avLst/>
+                      </a:prstTxWarp>
+                      <a:spAutoFit/>
+                    </wps:bodyPr>
+                  </wps:wsp>
+                </a:graphicData>
+              </a:graphic>
+            </wp:anchor>
+          </w:drawing>
+        </mc:Choice>
+        <mc:Fallback>
+          <w:pict>
+            <v:shapetype w14:anchorId="3562D521" id="_x0000_t202" coordsize="21600,21600" o:spt="202" path="m,l,21600r21600,l21600,xe">
+              <v:stroke joinstyle="miter"/>
+              <v:path gradientshapeok="t" o:connecttype="rect"/>
+            </v:shapetype>
+            <v:shape id="Text Box 1" o:spid="_x0000_s1028" type="#_x0000_t202" alt="Internal" style="position:absolute;margin-left:0;margin-top:0;width:25.4pt;height:26.3pt;z-index:251658240;visibility:visible;mso-wrap-style:none;mso-wrap-distance-left:0;mso-wrap-distance-top:0;mso-wrap-distance-right:0;mso-wrap-distance-bottom:0;mso-position-horizontal:center;mso-position-horizontal-relative:page;mso-position-vertical:bottom;mso-position-vertical-relative:page;v-text-anchor:bottom" o:gfxdata="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" filled="f" stroked="f">
+              <v:fill o:detectmouseclick="t"/>
+              <v:textbox style="mso-fit-shape-to-text:t" inset="0,0,0,15pt">
+                <w:txbxContent>
+                  <w:p>
+                    <w:pPr>
+                      <w:spacing w:after="0"/>
+                      <w:rPr>
+                        <w:rFonts w:ascii="Calibri" w:eastAsia="Calibri" w:hAnsi="Calibri" w:cs="Calibri"/>
+                        <w:noProof/>
+                        <w:color w:val="000000"/>
+                        <w:sz w:val="16"/>
+                        <w:szCs w:val="16"/>
+                      </w:rPr>
+                    </w:pPr>
+                    <w:r>
+                      <w:rPr>
+                        <w:rFonts w:ascii="Calibri" w:eastAsia="Calibri" w:hAnsi="Calibri" w:cs="Calibri"/>
+                        <w:noProof/>
+                        <w:color w:val="000000"/>
+                        <w:sz w:val="16"/>
+                        <w:szCs w:val="16"/>
+                      </w:rPr>
+                      <w:t>Internal</w:t>
+                    </w:r>
+                  </w:p>
+                </w:txbxContent>
+              </v:textbox>
+              <w10:wrap anchorx="page" anchory="page"/>
+            </v:shape>
+          </w:pict>
+        </mc:Fallback>
+      </mc:AlternateContent>
+    </w:r>
+  </w:p>
+</w:ftr>
+</file>
+
+<file path=word/footnotes.xml><?xml version="1.0" encoding="utf-8"?>
+<w:footnotes xmlns:wpc="http://schemas.microsoft.com/office/word/2010/wordprocessingCanvas" xmlns:cx="http://schemas.microsoft.com/office/drawing/2014/chartex" xmlns:cx1="http://schemas.microsoft.com/office/drawing/2015/9/8/chartex" xmlns:cx2="http://schemas.microsoft.com/office/drawing/2015/10/21/chartex" xmlns:cx3="http://schemas.microsoft.com/office/drawing/2016/5/9/chartex" xmlns:cx4="http://schemas.microsoft.com/office/drawing/2016/5/10/chartex" xmlns:cx5="http://schemas.microsoft.com/office/drawing/2016/5/11/chartex" xmlns:cx6="http://schemas.microsoft.com/office/drawing/2016/5/12/chartex" xmlns:cx7="http://schemas.microsoft.com/office/drawing/2016/5/13/chartex" xmlns:cx8="http://schemas.microsoft.com/office/drawing/2016/5/14/chartex" xmlns:mc="http://schemas.openxmlformats.org/markup-compatibility/2006" xmlns:aink="http://schemas.microsoft.com/office/drawing/2016/ink" xmlns:am3d="http://schemas.microsoft.com/office/drawing/2017/model3d" xmlns:o="urn:schemas-microsoft-com:office:office" xmlns:oel="http://schemas.microsoft.com/office/2019/extlst" xmlns:r="http://schemas.openxmlformats.org/officeDocument/2006/relationships" xmlns:m="http://schemas.openxmlformats.org/officeDocument/2006/math" xmlns:v="urn:schemas-microsoft-com:vml" xmlns:wp14="http://schemas.microsoft.com/office/word/2010/wordprocessingDrawing" xmlns:wp="http://schemas.openxmlformats.org/drawingml/2006/wordprocessingDrawing" xmlns:w10="urn:schemas-microsoft-com:office:word" xmlns:w="http://schemas.openxmlformats.org/wordprocessingml/2006/main" xmlns:w14="http://schemas.microsoft.com/office/word/2010/wordml" xmlns:w15="http://schemas.microsoft.com/office/word/2012/wordml" xmlns:w16cex="http://schemas.microsoft.com/office/word/2018/wordml/cex" xmlns:w16cid="http://schemas.microsoft.com/office/word/2016/wordml/cid" xmlns:w16="http://schemas.microsoft.com/office/word/2018/wordml" xmlns:w16sdtdh="http://schemas.microsoft.com/office/word/2020/wordml/sdtdatahash" xmlns:w16se="http://schemas.microsoft.com/office/word/2015/wordml/symex" xmlns:wpg="http://schemas.microsoft.com/office/word/2010/wordprocessingGroup" xmlns:wpi="http://schemas.microsoft.com/office/word/2010/wordprocessingInk" xmlns:wne="http://schemas.microsoft.com/office/word/2006/wordml" xmlns:wps="http://schemas.microsoft.com/office/word/2010/wordprocessingShape" mc:Ignorable="w14 w15 w16se w16cid w16 w16cex w16sdtdh wp14">
+  <w:footnote w:type="separator" w:id="-1">
+    <w:p>
+      <w:pPr>
+        <w:spacing w:after="0" w:line="240" w:lineRule="auto"/>
+      </w:pPr>
+      <w:r>
+        <w:separator/>
+      </w:r>
+    </w:p>
+  </w:footnote>
+  <w:footnote w:type="continuationSeparator" w:id="0">
+    <w:p>
+      <w:pPr>
+        <w:spacing w:after="0" w:line="240" w:lineRule="auto"/>
+      </w:pPr>
+      <w:r>
+        <w:continuationSeparator/>
+      </w:r>
+    </w:p>
+  </w:footnote>
+</w:footnotes>
+</file>
+
 <file path=word/numbering.xml><?xml version="1.0" encoding="utf-8"?>
-<w:numbering xmlns:wpc="http://schemas.microsoft.com/office/word/2010/wordprocessingCanvas" xmlns:cx="http://schemas.microsoft.com/office/drawing/2014/chartex" xmlns:cx1="http://schemas.microsoft.com/office/drawing/2015/9/8/chartex" xmlns:cx2="http://schemas.microsoft.com/office/drawing/2015/10/21/chartex" xmlns:cx3="http://schemas.microsoft.com/office/drawing/2016/5/9/chartex" xmlns:cx4="http://schemas.microsoft.com/office/drawing/2016/5/10/chartex" xmlns:cx5="http://schemas.microsoft.com/office/drawing/2016/5/11/chartex" xmlns:cx6="http://schemas.microsoft.com/office/drawing/2016/5/12/chartex" xmlns:cx7="http://schemas.microsoft.com/office/drawing/2016/5/13/chartex" xmlns:cx8="http://schemas.microsoft.com/office/drawing/2016/5/14/chartex" xmlns:mc="http://schemas.openxmlformats.org/markup-compatibility/2006" xmlns:aink="http://schemas.microsoft.com/office/drawing/2016/ink" xmlns:am3d="http://schemas.microsoft.com/office/drawing/2017/model3d" xmlns:o="urn:schemas-microsoft-com:office:office" xmlns:oel="http://schemas.microsoft.com/office/2019/extlst" xmlns:r="http://schemas.openxmlformats.org/officeDocument/2006/relationships" xmlns:m="http://schemas.openxmlformats.org/officeDocument/2006/math" xmlns:v="urn:schemas-microsoft-com:vml" xmlns:wp14="http://schemas.microsoft.com/office/word/2010/wordprocessingDrawing" xmlns:wp="http://schemas.openxmlformats.org/drawingml/2006/wordprocessingDrawing" xmlns:w10="urn:schemas-microsoft-com:office:word" xmlns:w="http://schemas.openxmlformats.org/wordprocessingml/2006/main" xmlns:w14="http://schemas.microsoft.com/office/word/2010/wordml" xmlns:w15="http://schemas.microsoft.com/office/word/2012/wordml" xmlns:w16cex="http://schemas.microsoft.com/office/word/2018/wordml/cex" xmlns:w16cid="http://schemas.microsoft.com/office/word/2016/wordml/cid" xmlns:w16="http://schemas.microsoft.com/office/word/2018/wordml" xmlns:w16du="http://schemas.microsoft.com/office/word/2023/wordml/word16du" xmlns:w16sdtdh="http://schemas.microsoft.com/office/word/2020/wordml/sdtdatahash" xmlns:w16sdtfl="http://schemas.microsoft.com/office/word/2024/wordml/sdtformatlock" xmlns:w16se="http://schemas.microsoft.com/office/word/2015/wordml/symex" xmlns:wpg="http://schemas.microsoft.com/office/word/2010/wordprocessingGroup" xmlns:wpi="http://schemas.microsoft.com/office/word/2010/wordprocessingInk" xmlns:wne="http://schemas.microsoft.com/office/word/2006/wordml" xmlns:wps="http://schemas.microsoft.com/office/word/2010/wordprocessingShape" mc:Ignorable="w14 w15 w16se w16cid w16 w16cex w16sdtdh w16sdtfl w16du wp14">
+<w:numbering xmlns:wpc="http://schemas.microsoft.com/office/word/2010/wordprocessingCanvas" xmlns:cx="http://schemas.microsoft.com/office/drawing/2014/chartex" xmlns:cx1="http://schemas.microsoft.com/office/drawing/2015/9/8/chartex" xmlns:cx2="http://schemas.microsoft.com/office/drawing/2015/10/21/chartex" xmlns:cx3="http://schemas.microsoft.com/office/drawing/2016/5/9/chartex" xmlns:cx4="http://schemas.microsoft.com/office/drawing/2016/5/10/chartex" xmlns:cx5="http://schemas.microsoft.com/office/drawing/2016/5/11/chartex" xmlns:cx6="http://schemas.microsoft.com/office/drawing/2016/5/12/chartex" xmlns:cx7="http://schemas.microsoft.com/office/drawing/2016/5/13/chartex" xmlns:cx8="http://schemas.microsoft.com/office/drawing/2016/5/14/chartex" xmlns:mc="http://schemas.openxmlformats.org/markup-compatibility/2006" xmlns:aink="http://schemas.microsoft.com/office/drawing/2016/ink" xmlns:am3d="http://schemas.microsoft.com/office/drawing/2017/model3d" xmlns:o="urn:schemas-microsoft-com:office:office" xmlns:oel="http://schemas.microsoft.com/office/2019/extlst" xmlns:r="http://schemas.openxmlformats.org/officeDocument/2006/relationships" xmlns:m="http://schemas.openxmlformats.org/officeDocument/2006/math" xmlns:v="urn:schemas-microsoft-com:vml" xmlns:wp14="http://schemas.microsoft.com/office/word/2010/wordprocessingDrawing" xmlns:wp="http://schemas.openxmlformats.org/drawingml/2006/wordprocessingDrawing" xmlns:w10="urn:schemas-microsoft-com:office:word" xmlns:w="http://schemas.openxmlformats.org/wordprocessingml/2006/main" xmlns:w14="http://schemas.microsoft.com/office/word/2010/wordml" xmlns:w15="http://schemas.microsoft.com/office/word/2012/wordml" xmlns:w16cex="http://schemas.microsoft.com/office/word/2018/wordml/cex" xmlns:w16cid="http://schemas.microsoft.com/office/word/2016/wordml/cid" xmlns:w16="http://schemas.microsoft.com/office/word/2018/wordml" xmlns:w16sdtdh="http://schemas.microsoft.com/office/word/2020/wordml/sdtdatahash" xmlns:w16se="http://schemas.microsoft.com/office/word/2015/wordml/symex" xmlns:wpg="http://schemas.microsoft.com/office/word/2010/wordprocessingGroup" xmlns:wpi="http://schemas.microsoft.com/office/word/2010/wordprocessingInk" xmlns:wne="http://schemas.microsoft.com/office/word/2006/wordml" xmlns:wps="http://schemas.microsoft.com/office/word/2010/wordprocessingShape" mc:Ignorable="w14 w15 w16se w16cid w16 w16cex w16sdtdh wp14">
   <w:abstractNum w:abstractNumId="0" w15:restartNumberingAfterBreak="0">
+    <w:nsid w:val="097F0ECC"/>
+    <w:multiLevelType w:val="hybridMultilevel"/>
+    <w:tmpl w:val="C4884FE4"/>
+    <w:lvl w:ilvl="0" w:tplc="6858633A">
+      <w:start w:val="1"/>
+      <w:numFmt w:val="decimal"/>
+      <w:lvlText w:val="%1."/>
+      <w:lvlJc w:val="left"/>
+      <w:pPr>
+        <w:ind w:left="1800" w:hanging="360"/>
+      </w:pPr>
+      <w:rPr>
+        <w:rFonts w:hint="default"/>
+      </w:rPr>
+    </w:lvl>
+    <w:lvl w:ilvl="1" w:tplc="04090019" w:tentative="1">
+      <w:start w:val="1"/>
+      <w:numFmt w:val="lowerLetter"/>
+      <w:lvlText w:val="%2."/>
+      <w:lvlJc w:val="left"/>
+      <w:pPr>
+        <w:ind w:left="2160" w:hanging="360"/>
+      </w:pPr>
+    </w:lvl>
+    <w:lvl w:ilvl="2" w:tplc="0409001B" w:tentative="1">
+      <w:start w:val="1"/>
+      <w:numFmt w:val="lowerRoman"/>
+      <w:lvlText w:val="%3."/>
+      <w:lvlJc w:val="right"/>
+      <w:pPr>
+        <w:ind w:left="2880" w:hanging="180"/>
+      </w:pPr>
+    </w:lvl>
+    <w:lvl w:ilvl="3" w:tplc="0409000F" w:tentative="1">
+      <w:start w:val="1"/>
+      <w:numFmt w:val="decimal"/>
+      <w:lvlText w:val="%4."/>
+      <w:lvlJc w:val="left"/>
+      <w:pPr>
+        <w:ind w:left="3600" w:hanging="360"/>
+      </w:pPr>
+    </w:lvl>
+    <w:lvl w:ilvl="4" w:tplc="04090019" w:tentative="1">
+      <w:start w:val="1"/>
+      <w:numFmt w:val="lowerLetter"/>
+      <w:lvlText w:val="%5."/>
+      <w:lvlJc w:val="left"/>
+      <w:pPr>
+        <w:ind w:left="4320" w:hanging="360"/>
+      </w:pPr>
+    </w:lvl>
+    <w:lvl w:ilvl="5" w:tplc="0409001B" w:tentative="1">
+      <w:start w:val="1"/>
+      <w:numFmt w:val="lowerRoman"/>
+      <w:lvlText w:val="%6."/>
+      <w:lvlJc w:val="right"/>
+      <w:pPr>
+        <w:ind w:left="5040" w:hanging="180"/>
+      </w:pPr>
+    </w:lvl>
+    <w:lvl w:ilvl="6" w:tplc="0409000F" w:tentative="1">
+      <w:start w:val="1"/>
+      <w:numFmt w:val="decimal"/>
+      <w:lvlText w:val="%7."/>
+      <w:lvlJc w:val="left"/>
+      <w:pPr>
+        <w:ind w:left="5760" w:hanging="360"/>
+      </w:pPr>
+    </w:lvl>
+    <w:lvl w:ilvl="7" w:tplc="04090019" w:tentative="1">
+      <w:start w:val="1"/>
+      <w:numFmt w:val="lowerLetter"/>
+      <w:lvlText w:val="%8."/>
+      <w:lvlJc w:val="left"/>
+      <w:pPr>
+        <w:ind w:left="6480" w:hanging="360"/>
+      </w:pPr>
+    </w:lvl>
+    <w:lvl w:ilvl="8" w:tplc="0409001B" w:tentative="1">
+      <w:start w:val="1"/>
+      <w:numFmt w:val="lowerRoman"/>
+      <w:lvlText w:val="%9."/>
+      <w:lvlJc w:val="right"/>
+      <w:pPr>
+        <w:ind w:left="7200" w:hanging="180"/>
+      </w:pPr>
+    </w:lvl>
+  </w:abstractNum>
+  <w:abstractNum w:abstractNumId="1" w15:restartNumberingAfterBreak="0">
     <w:nsid w:val="24760A7D"/>
     <w:multiLevelType w:val="hybridMultilevel"/>
     <w:tmpl w:val="02502F86"/>
@@ -2069,7 +3076,7 @@
       </w:pPr>
     </w:lvl>
   </w:abstractNum>
-  <w:abstractNum w:abstractNumId="1" w15:restartNumberingAfterBreak="0">
+  <w:abstractNum w:abstractNumId="2" w15:restartNumberingAfterBreak="0">
     <w:nsid w:val="3AD364C3"/>
     <w:multiLevelType w:val="hybridMultilevel"/>
     <w:tmpl w:val="C0CE4CA4"/>
@@ -2182,18 +3189,21 @@
       </w:rPr>
     </w:lvl>
   </w:abstractNum>
-  <w:abstractNum w:abstractNumId="2" w15:restartNumberingAfterBreak="0">
-    <w:nsid w:val="7090022F"/>
+  <w:abstractNum w:abstractNumId="3" w15:restartNumberingAfterBreak="0">
+    <w:nsid w:val="5BE17DEC"/>
     <w:multiLevelType w:val="hybridMultilevel"/>
-    <w:tmpl w:val="00C0409E"/>
-    <w:lvl w:ilvl="0" w:tplc="0409000F">
+    <w:tmpl w:val="0F5C88BE"/>
+    <w:lvl w:ilvl="0" w:tplc="6858633A">
       <w:start w:val="1"/>
       <w:numFmt w:val="decimal"/>
       <w:lvlText w:val="%1."/>
       <w:lvlJc w:val="left"/>
       <w:pPr>
-        <w:ind w:left="720" w:hanging="360"/>
-      </w:pPr>
+        <w:ind w:left="1080" w:hanging="360"/>
+      </w:pPr>
+      <w:rPr>
+        <w:rFonts w:hint="default"/>
+      </w:rPr>
     </w:lvl>
     <w:lvl w:ilvl="1" w:tplc="04090019" w:tentative="1">
       <w:start w:val="1"/>
@@ -2268,20 +3278,204 @@
       </w:pPr>
     </w:lvl>
   </w:abstractNum>
+  <w:abstractNum w:abstractNumId="4" w15:restartNumberingAfterBreak="0">
+    <w:nsid w:val="68A5420A"/>
+    <w:multiLevelType w:val="hybridMultilevel"/>
+    <w:tmpl w:val="3CE444B4"/>
+    <w:lvl w:ilvl="0" w:tplc="6858633A">
+      <w:start w:val="1"/>
+      <w:numFmt w:val="decimal"/>
+      <w:lvlText w:val="%1."/>
+      <w:lvlJc w:val="left"/>
+      <w:pPr>
+        <w:ind w:left="1080" w:hanging="360"/>
+      </w:pPr>
+      <w:rPr>
+        <w:rFonts w:hint="default"/>
+      </w:rPr>
+    </w:lvl>
+    <w:lvl w:ilvl="1" w:tplc="04090019" w:tentative="1">
+      <w:start w:val="1"/>
+      <w:numFmt w:val="lowerLetter"/>
+      <w:lvlText w:val="%2."/>
+      <w:lvlJc w:val="left"/>
+      <w:pPr>
+        <w:ind w:left="1800" w:hanging="360"/>
+      </w:pPr>
+    </w:lvl>
+    <w:lvl w:ilvl="2" w:tplc="0409001B" w:tentative="1">
+      <w:start w:val="1"/>
+      <w:numFmt w:val="lowerRoman"/>
+      <w:lvlText w:val="%3."/>
+      <w:lvlJc w:val="right"/>
+      <w:pPr>
+        <w:ind w:left="2520" w:hanging="180"/>
+      </w:pPr>
+    </w:lvl>
+    <w:lvl w:ilvl="3" w:tplc="0409000F" w:tentative="1">
+      <w:start w:val="1"/>
+      <w:numFmt w:val="decimal"/>
+      <w:lvlText w:val="%4."/>
+      <w:lvlJc w:val="left"/>
+      <w:pPr>
+        <w:ind w:left="3240" w:hanging="360"/>
+      </w:pPr>
+    </w:lvl>
+    <w:lvl w:ilvl="4" w:tplc="04090019" w:tentative="1">
+      <w:start w:val="1"/>
+      <w:numFmt w:val="lowerLetter"/>
+      <w:lvlText w:val="%5."/>
+      <w:lvlJc w:val="left"/>
+      <w:pPr>
+        <w:ind w:left="3960" w:hanging="360"/>
+      </w:pPr>
+    </w:lvl>
+    <w:lvl w:ilvl="5" w:tplc="0409001B" w:tentative="1">
+      <w:start w:val="1"/>
+      <w:numFmt w:val="lowerRoman"/>
+      <w:lvlText w:val="%6."/>
+      <w:lvlJc w:val="right"/>
+      <w:pPr>
+        <w:ind w:left="4680" w:hanging="180"/>
+      </w:pPr>
+    </w:lvl>
+    <w:lvl w:ilvl="6" w:tplc="0409000F" w:tentative="1">
+      <w:start w:val="1"/>
+      <w:numFmt w:val="decimal"/>
+      <w:lvlText w:val="%7."/>
+      <w:lvlJc w:val="left"/>
+      <w:pPr>
+        <w:ind w:left="5400" w:hanging="360"/>
+      </w:pPr>
+    </w:lvl>
+    <w:lvl w:ilvl="7" w:tplc="04090019" w:tentative="1">
+      <w:start w:val="1"/>
+      <w:numFmt w:val="lowerLetter"/>
+      <w:lvlText w:val="%8."/>
+      <w:lvlJc w:val="left"/>
+      <w:pPr>
+        <w:ind w:left="6120" w:hanging="360"/>
+      </w:pPr>
+    </w:lvl>
+    <w:lvl w:ilvl="8" w:tplc="0409001B" w:tentative="1">
+      <w:start w:val="1"/>
+      <w:numFmt w:val="lowerRoman"/>
+      <w:lvlText w:val="%9."/>
+      <w:lvlJc w:val="right"/>
+      <w:pPr>
+        <w:ind w:left="6840" w:hanging="180"/>
+      </w:pPr>
+    </w:lvl>
+  </w:abstractNum>
+  <w:abstractNum w:abstractNumId="5" w15:restartNumberingAfterBreak="0">
+    <w:nsid w:val="7090022F"/>
+    <w:multiLevelType w:val="hybridMultilevel"/>
+    <w:tmpl w:val="95544768"/>
+    <w:lvl w:ilvl="0" w:tplc="0409000F">
+      <w:start w:val="1"/>
+      <w:numFmt w:val="decimal"/>
+      <w:lvlText w:val="%1."/>
+      <w:lvlJc w:val="left"/>
+      <w:pPr>
+        <w:ind w:left="720" w:hanging="360"/>
+      </w:pPr>
+    </w:lvl>
+    <w:lvl w:ilvl="1" w:tplc="04090019" w:tentative="1">
+      <w:start w:val="1"/>
+      <w:numFmt w:val="lowerLetter"/>
+      <w:lvlText w:val="%2."/>
+      <w:lvlJc w:val="left"/>
+      <w:pPr>
+        <w:ind w:left="1440" w:hanging="360"/>
+      </w:pPr>
+    </w:lvl>
+    <w:lvl w:ilvl="2" w:tplc="0409001B" w:tentative="1">
+      <w:start w:val="1"/>
+      <w:numFmt w:val="lowerRoman"/>
+      <w:lvlText w:val="%3."/>
+      <w:lvlJc w:val="right"/>
+      <w:pPr>
+        <w:ind w:left="2160" w:hanging="180"/>
+      </w:pPr>
+    </w:lvl>
+    <w:lvl w:ilvl="3" w:tplc="0409000F" w:tentative="1">
+      <w:start w:val="1"/>
+      <w:numFmt w:val="decimal"/>
+      <w:lvlText w:val="%4."/>
+      <w:lvlJc w:val="left"/>
+      <w:pPr>
+        <w:ind w:left="2880" w:hanging="360"/>
+      </w:pPr>
+    </w:lvl>
+    <w:lvl w:ilvl="4" w:tplc="04090019" w:tentative="1">
+      <w:start w:val="1"/>
+      <w:numFmt w:val="lowerLetter"/>
+      <w:lvlText w:val="%5."/>
+      <w:lvlJc w:val="left"/>
+      <w:pPr>
+        <w:ind w:left="3600" w:hanging="360"/>
+      </w:pPr>
+    </w:lvl>
+    <w:lvl w:ilvl="5" w:tplc="0409001B" w:tentative="1">
+      <w:start w:val="1"/>
+      <w:numFmt w:val="lowerRoman"/>
+      <w:lvlText w:val="%6."/>
+      <w:lvlJc w:val="right"/>
+      <w:pPr>
+        <w:ind w:left="4320" w:hanging="180"/>
+      </w:pPr>
+    </w:lvl>
+    <w:lvl w:ilvl="6" w:tplc="0409000F" w:tentative="1">
+      <w:start w:val="1"/>
+      <w:numFmt w:val="decimal"/>
+      <w:lvlText w:val="%7."/>
+      <w:lvlJc w:val="left"/>
+      <w:pPr>
+        <w:ind w:left="5040" w:hanging="360"/>
+      </w:pPr>
+    </w:lvl>
+    <w:lvl w:ilvl="7" w:tplc="04090019" w:tentative="1">
+      <w:start w:val="1"/>
+      <w:numFmt w:val="lowerLetter"/>
+      <w:lvlText w:val="%8."/>
+      <w:lvlJc w:val="left"/>
+      <w:pPr>
+        <w:ind w:left="5760" w:hanging="360"/>
+      </w:pPr>
+    </w:lvl>
+    <w:lvl w:ilvl="8" w:tplc="0409001B" w:tentative="1">
+      <w:start w:val="1"/>
+      <w:numFmt w:val="lowerRoman"/>
+      <w:lvlText w:val="%9."/>
+      <w:lvlJc w:val="right"/>
+      <w:pPr>
+        <w:ind w:left="6480" w:hanging="180"/>
+      </w:pPr>
+    </w:lvl>
+  </w:abstractNum>
   <w:num w:numId="1" w16cid:durableId="1306930997">
+    <w:abstractNumId w:val="2"/>
+  </w:num>
+  <w:num w:numId="2" w16cid:durableId="364210332">
+    <w:abstractNumId w:val="5"/>
+  </w:num>
+  <w:num w:numId="3" w16cid:durableId="738020194">
     <w:abstractNumId w:val="1"/>
   </w:num>
-  <w:num w:numId="2" w16cid:durableId="364210332">
-    <w:abstractNumId w:val="2"/>
+  <w:num w:numId="4" w16cid:durableId="270288314">
+    <w:abstractNumId w:val="4"/>
   </w:num>
-  <w:num w:numId="3" w16cid:durableId="738020194">
+  <w:num w:numId="5" w16cid:durableId="326983095">
     <w:abstractNumId w:val="0"/>
+  </w:num>
+  <w:num w:numId="6" w16cid:durableId="1317106277">
+    <w:abstractNumId w:val="3"/>
   </w:num>
 </w:numbering>
 </file>
 
 <file path=word/styles.xml><?xml version="1.0" encoding="utf-8"?>
-<w:styles xmlns:mc="http://schemas.openxmlformats.org/markup-compatibility/2006" xmlns:r="http://schemas.openxmlformats.org/officeDocument/2006/relationships" xmlns:w="http://schemas.openxmlformats.org/wordprocessingml/2006/main" xmlns:w14="http://schemas.microsoft.com/office/word/2010/wordml" xmlns:w15="http://schemas.microsoft.com/office/word/2012/wordml" xmlns:w16cex="http://schemas.microsoft.com/office/word/2018/wordml/cex" xmlns:w16cid="http://schemas.microsoft.com/office/word/2016/wordml/cid" xmlns:w16="http://schemas.microsoft.com/office/word/2018/wordml" xmlns:w16du="http://schemas.microsoft.com/office/word/2023/wordml/word16du" xmlns:w16sdtdh="http://schemas.microsoft.com/office/word/2020/wordml/sdtdatahash" xmlns:w16sdtfl="http://schemas.microsoft.com/office/word/2024/wordml/sdtformatlock" xmlns:w16se="http://schemas.microsoft.com/office/word/2015/wordml/symex" mc:Ignorable="w14 w15 w16se w16cid w16 w16cex w16sdtdh w16sdtfl w16du">
+<w:styles xmlns:mc="http://schemas.openxmlformats.org/markup-compatibility/2006" xmlns:r="http://schemas.openxmlformats.org/officeDocument/2006/relationships" xmlns:w="http://schemas.openxmlformats.org/wordprocessingml/2006/main" xmlns:w14="http://schemas.microsoft.com/office/word/2010/wordml" xmlns:w15="http://schemas.microsoft.com/office/word/2012/wordml" xmlns:w16cex="http://schemas.microsoft.com/office/word/2018/wordml/cex" xmlns:w16cid="http://schemas.microsoft.com/office/word/2016/wordml/cid" xmlns:w16="http://schemas.microsoft.com/office/word/2018/wordml" xmlns:w16sdtdh="http://schemas.microsoft.com/office/word/2020/wordml/sdtdatahash" xmlns:w16se="http://schemas.microsoft.com/office/word/2015/wordml/symex" mc:Ignorable="w14 w15 w16se w16cid w16 w16cex w16sdtdh">
   <w:docDefaults>
     <w:rPrDefault>
       <w:rPr>
@@ -2883,6 +4077,7 @@
   <w:style w:type="character" w:default="1" w:styleId="DefaultParagraphFont">
     <w:name w:val="Default Paragraph Font"/>
     <w:uiPriority w:val="1"/>
+    <w:semiHidden/>
     <w:unhideWhenUsed/>
   </w:style>
   <w:style w:type="table" w:default="1" w:styleId="TableNormal">
@@ -3219,6 +4414,28 @@
       <w:shd w:val="clear" w:color="auto" w:fill="E1DFDD"/>
     </w:rPr>
   </w:style>
+  <w:style w:type="paragraph" w:styleId="Footer">
+    <w:name w:val="footer"/>
+    <w:basedOn w:val="Normal"/>
+    <w:link w:val="FooterChar"/>
+    <w:uiPriority w:val="99"/>
+    <w:unhideWhenUsed/>
+    <w:rsid w:val="00367142"/>
+    <w:pPr>
+      <w:tabs>
+        <w:tab w:val="center" w:pos="4680"/>
+        <w:tab w:val="right" w:pos="9360"/>
+      </w:tabs>
+      <w:spacing w:after="0" w:line="240" w:lineRule="auto"/>
+    </w:pPr>
+  </w:style>
+  <w:style w:type="character" w:customStyle="1" w:styleId="FooterChar">
+    <w:name w:val="Footer Char"/>
+    <w:basedOn w:val="DefaultParagraphFont"/>
+    <w:link w:val="Footer"/>
+    <w:uiPriority w:val="99"/>
+    <w:rsid w:val="00367142"/>
+  </w:style>
 </w:styles>
 </file>
 
@@ -3515,4 +4732,10 @@
     </a:ext>
   </a:extLst>
 </a:theme>
+</file>
+
+<file path=docMetadata/LabelInfo.xml><?xml version="1.0" encoding="utf-8"?>
+<clbl:labelList xmlns:clbl="http://schemas.microsoft.com/office/2020/mipLabelMetadata">
+  <clbl:label id="{7e753c2c-bb14-4786-921b-97c6a6fc424f}" enabled="1" method="Standard" siteId="{3bd97919-57c3-48d3-9e9a-8e4c01614a8f}" contentBits="2" removed="0"/>
+</clbl:labelList>
 </file>
</xml_diff>